<commit_message>
A typo in the report has been fixed.
</commit_message>
<xml_diff>
--- a/Отчет.docx
+++ b/Отчет.docx
@@ -1011,7 +1011,8 @@
         </w:rPr>
         <w:drawing>
           <wp:inline>
-            <wp:extent cx="3578224" cy="3166821"/>
+            <wp:extent cx="3578223" cy="3166821"/>
+            <wp:effectExtent b="0" l="0" r="0" t="0"/>
             <wp:docPr hidden="false" id="2" name="Picture 2"/>
             <a:graphic>
               <a:graphicData uri="http://schemas.openxmlformats.org/drawingml/2006/picture">
@@ -1026,7 +1027,7 @@
                   </pic:blipFill>
                   <pic:spPr>
                     <a:xfrm flipH="false" flipV="false" rot="0">
-                      <a:ext cx="3578224" cy="3166821"/>
+                      <a:ext cx="3578223" cy="3166821"/>
                     </a:xfrm>
                     <a:prstGeom prst="rect"/>
                   </pic:spPr>
@@ -1187,6 +1188,7 @@
               <w:drawing>
                 <wp:inline>
                   <wp:extent cx="2829560" cy="2829560"/>
+                  <wp:effectExtent b="0" l="0" r="0" t="0"/>
                   <wp:docPr hidden="false" id="4" name="Picture 4"/>
                   <a:graphic>
                     <a:graphicData uri="http://schemas.openxmlformats.org/drawingml/2006/picture">
@@ -1242,6 +1244,7 @@
               <w:drawing>
                 <wp:inline>
                   <wp:extent cx="2830195" cy="2830195"/>
+                  <wp:effectExtent b="0" l="0" r="0" t="0"/>
                   <wp:docPr hidden="false" id="6" name="Picture 6"/>
                   <a:graphic>
                     <a:graphicData uri="http://schemas.openxmlformats.org/drawingml/2006/picture">
@@ -1299,6 +1302,7 @@
               <w:drawing>
                 <wp:inline>
                   <wp:extent cx="2829560" cy="2829560"/>
+                  <wp:effectExtent b="0" l="0" r="0" t="0"/>
                   <wp:docPr hidden="false" id="8" name="Picture 8"/>
                   <a:graphic>
                     <a:graphicData uri="http://schemas.openxmlformats.org/drawingml/2006/picture">
@@ -1354,6 +1358,7 @@
               <w:drawing>
                 <wp:inline>
                   <wp:extent cx="2830195" cy="2830195"/>
+                  <wp:effectExtent b="0" l="0" r="0" t="0"/>
                   <wp:docPr hidden="false" id="10" name="Picture 10"/>
                   <a:graphic>
                     <a:graphicData uri="http://schemas.openxmlformats.org/drawingml/2006/picture">
@@ -1411,6 +1416,7 @@
               <w:drawing>
                 <wp:inline>
                   <wp:extent cx="2829560" cy="2829560"/>
+                  <wp:effectExtent b="0" l="0" r="0" t="0"/>
                   <wp:docPr hidden="false" id="12" name="Picture 12"/>
                   <a:graphic>
                     <a:graphicData uri="http://schemas.openxmlformats.org/drawingml/2006/picture">
@@ -1466,6 +1472,7 @@
               <w:drawing>
                 <wp:inline>
                   <wp:extent cx="2830195" cy="2830195"/>
+                  <wp:effectExtent b="0" l="0" r="0" t="0"/>
                   <wp:docPr hidden="false" id="14" name="Picture 14"/>
                   <a:graphic>
                     <a:graphicData uri="http://schemas.openxmlformats.org/drawingml/2006/picture">
@@ -1536,11 +1543,32 @@
           <w:sz w:val="28"/>
           <w:highlight w:val="white"/>
         </w:rPr>
-        <w:t>В ходе выполнения лабораторной работы была написана программа на языка Python, для симуляции и визуализации движения системы тел в соответствии с заданными законами движения.</w:t>
-      </w:r>
-    </w:p>
-    <w:p>
-      <w:pPr>
+        <w:t>В ходе выполнения лабораторной работы была написана программа на яз</w:t>
+      </w:r>
+      <w:r>
+        <w:rPr>
+          <w:rStyle w:val="Style_1_ch"/>
+          <w:rFonts w:ascii="Times New Roman" w:hAnsi="Times New Roman"/>
+          <w:color w:val="000000"/>
+          <w:sz w:val="28"/>
+          <w:highlight w:val="white"/>
+        </w:rPr>
+        <w:t xml:space="preserve">ыке </w:t>
+      </w:r>
+      <w:r>
+        <w:rPr>
+          <w:rStyle w:val="Style_1_ch"/>
+          <w:rFonts w:ascii="Times New Roman" w:hAnsi="Times New Roman"/>
+          <w:color w:val="000000"/>
+          <w:sz w:val="28"/>
+          <w:highlight w:val="white"/>
+        </w:rPr>
+        <w:t>Python, для симуляции и визуализации движения системы тел в соответствии с заданными законами движения.</w:t>
+      </w:r>
+    </w:p>
+    <w:p>
+      <w:pPr>
+        <w:widowControl w:val="1"/>
         <w:ind/>
         <w:jc w:val="center"/>
         <w:rPr>
@@ -1571,6 +1599,7 @@
     </w:p>
     <w:p>
       <w:pPr>
+        <w:widowControl w:val="1"/>
         <w:spacing w:line="240" w:lineRule="auto"/>
         <w:ind w:firstLine="0" w:left="-709"/>
         <w:jc w:val="left"/>
@@ -1591,6 +1620,7 @@
     </w:p>
     <w:p>
       <w:pPr>
+        <w:widowControl w:val="1"/>
         <w:spacing w:line="240" w:lineRule="auto"/>
         <w:ind w:firstLine="0" w:left="-709"/>
         <w:jc w:val="left"/>
@@ -1611,6 +1641,7 @@
     </w:p>
     <w:p>
       <w:pPr>
+        <w:widowControl w:val="1"/>
         <w:spacing w:line="240" w:lineRule="auto"/>
         <w:ind w:firstLine="0" w:left="-709"/>
         <w:jc w:val="left"/>
@@ -1631,30 +1662,33 @@
     </w:p>
     <w:p>
       <w:pPr>
-        <w:spacing w:line="240" w:lineRule="auto"/>
-        <w:ind w:firstLine="0" w:left="-709"/>
-        <w:jc w:val="left"/>
-        <w:rPr>
-          <w:rFonts w:ascii="Times New Roman" w:hAnsi="Times New Roman"/>
-          <w:spacing w:val="0"/>
-          <w:sz w:val="16"/>
-        </w:rPr>
-      </w:pPr>
-    </w:p>
-    <w:p>
-      <w:pPr>
-        <w:spacing w:line="240" w:lineRule="auto"/>
-        <w:ind w:firstLine="0" w:left="-709"/>
-        <w:jc w:val="left"/>
-        <w:rPr>
-          <w:rFonts w:ascii="Times New Roman" w:hAnsi="Times New Roman"/>
-          <w:spacing w:val="0"/>
-          <w:sz w:val="16"/>
-        </w:rPr>
-      </w:pPr>
-    </w:p>
-    <w:p>
-      <w:pPr>
+        <w:widowControl w:val="1"/>
+        <w:spacing w:line="240" w:lineRule="auto"/>
+        <w:ind w:firstLine="0" w:left="-709"/>
+        <w:jc w:val="left"/>
+        <w:rPr>
+          <w:rFonts w:ascii="Times New Roman" w:hAnsi="Times New Roman"/>
+          <w:spacing w:val="0"/>
+          <w:sz w:val="16"/>
+        </w:rPr>
+      </w:pPr>
+    </w:p>
+    <w:p>
+      <w:pPr>
+        <w:widowControl w:val="1"/>
+        <w:spacing w:line="240" w:lineRule="auto"/>
+        <w:ind w:firstLine="0" w:left="-709"/>
+        <w:jc w:val="left"/>
+        <w:rPr>
+          <w:rFonts w:ascii="Times New Roman" w:hAnsi="Times New Roman"/>
+          <w:spacing w:val="0"/>
+          <w:sz w:val="16"/>
+        </w:rPr>
+      </w:pPr>
+    </w:p>
+    <w:p>
+      <w:pPr>
+        <w:widowControl w:val="1"/>
         <w:spacing w:line="240" w:lineRule="auto"/>
         <w:ind w:firstLine="0" w:left="-709"/>
         <w:jc w:val="left"/>
@@ -1675,6 +1709,7 @@
     </w:p>
     <w:p>
       <w:pPr>
+        <w:widowControl w:val="1"/>
         <w:spacing w:line="240" w:lineRule="auto"/>
         <w:ind w:firstLine="0" w:left="-709"/>
         <w:jc w:val="left"/>
@@ -1695,18 +1730,20 @@
     </w:p>
     <w:p>
       <w:pPr>
-        <w:spacing w:line="240" w:lineRule="auto"/>
-        <w:ind w:firstLine="0" w:left="-709"/>
-        <w:jc w:val="left"/>
-        <w:rPr>
-          <w:rFonts w:ascii="Times New Roman" w:hAnsi="Times New Roman"/>
-          <w:spacing w:val="0"/>
-          <w:sz w:val="16"/>
-        </w:rPr>
-      </w:pPr>
-    </w:p>
-    <w:p>
-      <w:pPr>
+        <w:widowControl w:val="1"/>
+        <w:spacing w:line="240" w:lineRule="auto"/>
+        <w:ind w:firstLine="0" w:left="-709"/>
+        <w:jc w:val="left"/>
+        <w:rPr>
+          <w:rFonts w:ascii="Times New Roman" w:hAnsi="Times New Roman"/>
+          <w:spacing w:val="0"/>
+          <w:sz w:val="16"/>
+        </w:rPr>
+      </w:pPr>
+    </w:p>
+    <w:p>
+      <w:pPr>
+        <w:widowControl w:val="1"/>
         <w:spacing w:line="240" w:lineRule="auto"/>
         <w:ind w:firstLine="0" w:left="-709"/>
         <w:jc w:val="left"/>
@@ -1727,6 +1764,7 @@
     </w:p>
     <w:p>
       <w:pPr>
+        <w:widowControl w:val="1"/>
         <w:spacing w:line="240" w:lineRule="auto"/>
         <w:ind w:firstLine="0" w:left="-709"/>
         <w:jc w:val="left"/>
@@ -1747,18 +1785,20 @@
     </w:p>
     <w:p>
       <w:pPr>
-        <w:spacing w:line="240" w:lineRule="auto"/>
-        <w:ind w:firstLine="0" w:left="-709"/>
-        <w:jc w:val="left"/>
-        <w:rPr>
-          <w:rFonts w:ascii="Times New Roman" w:hAnsi="Times New Roman"/>
-          <w:spacing w:val="0"/>
-          <w:sz w:val="16"/>
-        </w:rPr>
-      </w:pPr>
-    </w:p>
-    <w:p>
-      <w:pPr>
+        <w:widowControl w:val="1"/>
+        <w:spacing w:line="240" w:lineRule="auto"/>
+        <w:ind w:firstLine="0" w:left="-709"/>
+        <w:jc w:val="left"/>
+        <w:rPr>
+          <w:rFonts w:ascii="Times New Roman" w:hAnsi="Times New Roman"/>
+          <w:spacing w:val="0"/>
+          <w:sz w:val="16"/>
+        </w:rPr>
+      </w:pPr>
+    </w:p>
+    <w:p>
+      <w:pPr>
+        <w:widowControl w:val="1"/>
         <w:spacing w:line="240" w:lineRule="auto"/>
         <w:ind w:firstLine="0" w:left="-709"/>
         <w:jc w:val="left"/>
@@ -1779,6 +1819,7 @@
     </w:p>
     <w:p>
       <w:pPr>
+        <w:widowControl w:val="1"/>
         <w:spacing w:line="240" w:lineRule="auto"/>
         <w:ind w:firstLine="0" w:left="-709"/>
         <w:jc w:val="left"/>
@@ -1799,18 +1840,20 @@
     </w:p>
     <w:p>
       <w:pPr>
-        <w:spacing w:line="240" w:lineRule="auto"/>
-        <w:ind w:firstLine="0" w:left="-709"/>
-        <w:jc w:val="left"/>
-        <w:rPr>
-          <w:rFonts w:ascii="Times New Roman" w:hAnsi="Times New Roman"/>
-          <w:spacing w:val="0"/>
-          <w:sz w:val="16"/>
-        </w:rPr>
-      </w:pPr>
-    </w:p>
-    <w:p>
-      <w:pPr>
+        <w:widowControl w:val="1"/>
+        <w:spacing w:line="240" w:lineRule="auto"/>
+        <w:ind w:firstLine="0" w:left="-709"/>
+        <w:jc w:val="left"/>
+        <w:rPr>
+          <w:rFonts w:ascii="Times New Roman" w:hAnsi="Times New Roman"/>
+          <w:spacing w:val="0"/>
+          <w:sz w:val="16"/>
+        </w:rPr>
+      </w:pPr>
+    </w:p>
+    <w:p>
+      <w:pPr>
+        <w:widowControl w:val="1"/>
         <w:spacing w:line="240" w:lineRule="auto"/>
         <w:ind w:firstLine="0" w:left="-709"/>
         <w:jc w:val="left"/>
@@ -1831,6 +1874,7 @@
     </w:p>
     <w:p>
       <w:pPr>
+        <w:widowControl w:val="1"/>
         <w:spacing w:line="240" w:lineRule="auto"/>
         <w:ind w:firstLine="0" w:left="-709"/>
         <w:jc w:val="left"/>
@@ -1851,6 +1895,7 @@
     </w:p>
     <w:p>
       <w:pPr>
+        <w:widowControl w:val="1"/>
         <w:spacing w:line="240" w:lineRule="auto"/>
         <w:ind w:firstLine="0" w:left="-709"/>
         <w:jc w:val="left"/>
@@ -1871,6 +1916,7 @@
     </w:p>
     <w:p>
       <w:pPr>
+        <w:widowControl w:val="1"/>
         <w:spacing w:line="240" w:lineRule="auto"/>
         <w:ind w:firstLine="0" w:left="-709"/>
         <w:jc w:val="left"/>
@@ -1891,6 +1937,7 @@
     </w:p>
     <w:p>
       <w:pPr>
+        <w:widowControl w:val="1"/>
         <w:spacing w:line="240" w:lineRule="auto"/>
         <w:ind w:firstLine="0" w:left="-709"/>
         <w:jc w:val="left"/>
@@ -1911,6 +1958,7 @@
     </w:p>
     <w:p>
       <w:pPr>
+        <w:widowControl w:val="1"/>
         <w:spacing w:line="240" w:lineRule="auto"/>
         <w:ind w:firstLine="0" w:left="-709"/>
         <w:jc w:val="left"/>
@@ -1931,6 +1979,7 @@
     </w:p>
     <w:p>
       <w:pPr>
+        <w:widowControl w:val="1"/>
         <w:spacing w:line="240" w:lineRule="auto"/>
         <w:ind w:firstLine="0" w:left="-709"/>
         <w:jc w:val="left"/>
@@ -1951,6 +2000,7 @@
     </w:p>
     <w:p>
       <w:pPr>
+        <w:widowControl w:val="1"/>
         <w:spacing w:line="240" w:lineRule="auto"/>
         <w:ind w:firstLine="0" w:left="-709"/>
         <w:jc w:val="left"/>
@@ -1971,6 +2021,7 @@
     </w:p>
     <w:p>
       <w:pPr>
+        <w:widowControl w:val="1"/>
         <w:spacing w:line="240" w:lineRule="auto"/>
         <w:ind w:firstLine="0" w:left="-709"/>
         <w:jc w:val="left"/>
@@ -1991,6 +2042,7 @@
     </w:p>
     <w:p>
       <w:pPr>
+        <w:widowControl w:val="1"/>
         <w:spacing w:line="240" w:lineRule="auto"/>
         <w:ind w:firstLine="0" w:left="-709"/>
         <w:jc w:val="left"/>
@@ -2011,6 +2063,7 @@
     </w:p>
     <w:p>
       <w:pPr>
+        <w:widowControl w:val="1"/>
         <w:spacing w:line="240" w:lineRule="auto"/>
         <w:ind w:firstLine="0" w:left="-709"/>
         <w:jc w:val="left"/>
@@ -2031,6 +2084,7 @@
     </w:p>
     <w:p>
       <w:pPr>
+        <w:widowControl w:val="1"/>
         <w:spacing w:line="240" w:lineRule="auto"/>
         <w:ind w:firstLine="0" w:left="-709"/>
         <w:jc w:val="left"/>
@@ -2051,6 +2105,7 @@
     </w:p>
     <w:p>
       <w:pPr>
+        <w:widowControl w:val="1"/>
         <w:spacing w:line="240" w:lineRule="auto"/>
         <w:ind w:firstLine="0" w:left="-709"/>
         <w:jc w:val="left"/>
@@ -2071,6 +2126,7 @@
     </w:p>
     <w:p>
       <w:pPr>
+        <w:widowControl w:val="1"/>
         <w:spacing w:line="240" w:lineRule="auto"/>
         <w:ind w:firstLine="0" w:left="-709"/>
         <w:jc w:val="left"/>
@@ -2091,18 +2147,20 @@
     </w:p>
     <w:p>
       <w:pPr>
-        <w:spacing w:line="240" w:lineRule="auto"/>
-        <w:ind w:firstLine="0" w:left="-709"/>
-        <w:jc w:val="left"/>
-        <w:rPr>
-          <w:rFonts w:ascii="Times New Roman" w:hAnsi="Times New Roman"/>
-          <w:spacing w:val="0"/>
-          <w:sz w:val="16"/>
-        </w:rPr>
-      </w:pPr>
-    </w:p>
-    <w:p>
-      <w:pPr>
+        <w:widowControl w:val="1"/>
+        <w:spacing w:line="240" w:lineRule="auto"/>
+        <w:ind w:firstLine="0" w:left="-709"/>
+        <w:jc w:val="left"/>
+        <w:rPr>
+          <w:rFonts w:ascii="Times New Roman" w:hAnsi="Times New Roman"/>
+          <w:spacing w:val="0"/>
+          <w:sz w:val="16"/>
+        </w:rPr>
+      </w:pPr>
+    </w:p>
+    <w:p>
+      <w:pPr>
+        <w:widowControl w:val="1"/>
         <w:spacing w:line="240" w:lineRule="auto"/>
         <w:ind w:firstLine="0" w:left="-709"/>
         <w:jc w:val="left"/>
@@ -2123,6 +2181,7 @@
     </w:p>
     <w:p>
       <w:pPr>
+        <w:widowControl w:val="1"/>
         <w:spacing w:line="240" w:lineRule="auto"/>
         <w:ind w:firstLine="0" w:left="-709"/>
         <w:jc w:val="left"/>
@@ -2143,6 +2202,7 @@
     </w:p>
     <w:p>
       <w:pPr>
+        <w:widowControl w:val="1"/>
         <w:spacing w:line="240" w:lineRule="auto"/>
         <w:ind w:firstLine="0" w:left="-709"/>
         <w:jc w:val="left"/>
@@ -2163,6 +2223,7 @@
     </w:p>
     <w:p>
       <w:pPr>
+        <w:widowControl w:val="1"/>
         <w:spacing w:line="240" w:lineRule="auto"/>
         <w:ind w:firstLine="0" w:left="-709"/>
         <w:jc w:val="left"/>
@@ -2183,6 +2244,7 @@
     </w:p>
     <w:p>
       <w:pPr>
+        <w:widowControl w:val="1"/>
         <w:spacing w:line="240" w:lineRule="auto"/>
         <w:ind w:firstLine="0" w:left="-709"/>
         <w:jc w:val="left"/>
@@ -2203,6 +2265,7 @@
     </w:p>
     <w:p>
       <w:pPr>
+        <w:widowControl w:val="1"/>
         <w:spacing w:line="240" w:lineRule="auto"/>
         <w:ind w:firstLine="0" w:left="-709"/>
         <w:jc w:val="left"/>
@@ -2223,6 +2286,7 @@
     </w:p>
     <w:p>
       <w:pPr>
+        <w:widowControl w:val="1"/>
         <w:spacing w:line="240" w:lineRule="auto"/>
         <w:ind w:firstLine="0" w:left="-709"/>
         <w:jc w:val="left"/>
@@ -2243,18 +2307,20 @@
     </w:p>
     <w:p>
       <w:pPr>
-        <w:spacing w:line="240" w:lineRule="auto"/>
-        <w:ind w:firstLine="0" w:left="-709"/>
-        <w:jc w:val="left"/>
-        <w:rPr>
-          <w:rFonts w:ascii="Times New Roman" w:hAnsi="Times New Roman"/>
-          <w:spacing w:val="0"/>
-          <w:sz w:val="16"/>
-        </w:rPr>
-      </w:pPr>
-    </w:p>
-    <w:p>
-      <w:pPr>
+        <w:widowControl w:val="1"/>
+        <w:spacing w:line="240" w:lineRule="auto"/>
+        <w:ind w:firstLine="0" w:left="-709"/>
+        <w:jc w:val="left"/>
+        <w:rPr>
+          <w:rFonts w:ascii="Times New Roman" w:hAnsi="Times New Roman"/>
+          <w:spacing w:val="0"/>
+          <w:sz w:val="16"/>
+        </w:rPr>
+      </w:pPr>
+    </w:p>
+    <w:p>
+      <w:pPr>
+        <w:widowControl w:val="1"/>
         <w:spacing w:line="240" w:lineRule="auto"/>
         <w:ind w:firstLine="0" w:left="-709"/>
         <w:jc w:val="left"/>
@@ -2275,6 +2341,7 @@
     </w:p>
     <w:p>
       <w:pPr>
+        <w:widowControl w:val="1"/>
         <w:spacing w:line="240" w:lineRule="auto"/>
         <w:ind w:firstLine="0" w:left="-709"/>
         <w:jc w:val="left"/>
@@ -2295,18 +2362,20 @@
     </w:p>
     <w:p>
       <w:pPr>
-        <w:spacing w:line="240" w:lineRule="auto"/>
-        <w:ind w:firstLine="0" w:left="-709"/>
-        <w:jc w:val="left"/>
-        <w:rPr>
-          <w:rFonts w:ascii="Times New Roman" w:hAnsi="Times New Roman"/>
-          <w:spacing w:val="0"/>
-          <w:sz w:val="16"/>
-        </w:rPr>
-      </w:pPr>
-    </w:p>
-    <w:p>
-      <w:pPr>
+        <w:widowControl w:val="1"/>
+        <w:spacing w:line="240" w:lineRule="auto"/>
+        <w:ind w:firstLine="0" w:left="-709"/>
+        <w:jc w:val="left"/>
+        <w:rPr>
+          <w:rFonts w:ascii="Times New Roman" w:hAnsi="Times New Roman"/>
+          <w:spacing w:val="0"/>
+          <w:sz w:val="16"/>
+        </w:rPr>
+      </w:pPr>
+    </w:p>
+    <w:p>
+      <w:pPr>
+        <w:widowControl w:val="1"/>
         <w:spacing w:line="240" w:lineRule="auto"/>
         <w:ind w:firstLine="0" w:left="-709"/>
         <w:jc w:val="left"/>
@@ -2327,6 +2396,7 @@
     </w:p>
     <w:p>
       <w:pPr>
+        <w:widowControl w:val="1"/>
         <w:spacing w:line="240" w:lineRule="auto"/>
         <w:ind w:firstLine="0" w:left="-709"/>
         <w:jc w:val="left"/>
@@ -2347,18 +2417,20 @@
     </w:p>
     <w:p>
       <w:pPr>
-        <w:spacing w:line="240" w:lineRule="auto"/>
-        <w:ind w:firstLine="0" w:left="-709"/>
-        <w:jc w:val="left"/>
-        <w:rPr>
-          <w:rFonts w:ascii="Times New Roman" w:hAnsi="Times New Roman"/>
-          <w:spacing w:val="0"/>
-          <w:sz w:val="16"/>
-        </w:rPr>
-      </w:pPr>
-    </w:p>
-    <w:p>
-      <w:pPr>
+        <w:widowControl w:val="1"/>
+        <w:spacing w:line="240" w:lineRule="auto"/>
+        <w:ind w:firstLine="0" w:left="-709"/>
+        <w:jc w:val="left"/>
+        <w:rPr>
+          <w:rFonts w:ascii="Times New Roman" w:hAnsi="Times New Roman"/>
+          <w:spacing w:val="0"/>
+          <w:sz w:val="16"/>
+        </w:rPr>
+      </w:pPr>
+    </w:p>
+    <w:p>
+      <w:pPr>
+        <w:widowControl w:val="1"/>
         <w:spacing w:line="240" w:lineRule="auto"/>
         <w:ind w:firstLine="0" w:left="-709"/>
         <w:jc w:val="left"/>
@@ -2379,6 +2451,7 @@
     </w:p>
     <w:p>
       <w:pPr>
+        <w:widowControl w:val="1"/>
         <w:spacing w:line="240" w:lineRule="auto"/>
         <w:ind w:firstLine="0" w:left="-709"/>
         <w:jc w:val="left"/>
@@ -2399,6 +2472,7 @@
     </w:p>
     <w:p>
       <w:pPr>
+        <w:widowControl w:val="1"/>
         <w:spacing w:line="240" w:lineRule="auto"/>
         <w:ind w:firstLine="0" w:left="-709"/>
         <w:jc w:val="left"/>
@@ -2419,6 +2493,7 @@
     </w:p>
     <w:p>
       <w:pPr>
+        <w:widowControl w:val="1"/>
         <w:spacing w:line="240" w:lineRule="auto"/>
         <w:ind w:firstLine="0" w:left="-709"/>
         <w:jc w:val="left"/>
@@ -2439,6 +2514,7 @@
     </w:p>
     <w:p>
       <w:pPr>
+        <w:widowControl w:val="1"/>
         <w:spacing w:line="240" w:lineRule="auto"/>
         <w:ind w:firstLine="0" w:left="-709"/>
         <w:jc w:val="left"/>
@@ -2459,6 +2535,7 @@
     </w:p>
     <w:p>
       <w:pPr>
+        <w:widowControl w:val="1"/>
         <w:spacing w:line="240" w:lineRule="auto"/>
         <w:ind w:firstLine="0" w:left="-709"/>
         <w:jc w:val="left"/>
@@ -2479,18 +2556,20 @@
     </w:p>
     <w:p>
       <w:pPr>
-        <w:spacing w:line="240" w:lineRule="auto"/>
-        <w:ind w:firstLine="0" w:left="-709"/>
-        <w:jc w:val="left"/>
-        <w:rPr>
-          <w:rFonts w:ascii="Times New Roman" w:hAnsi="Times New Roman"/>
-          <w:spacing w:val="0"/>
-          <w:sz w:val="16"/>
-        </w:rPr>
-      </w:pPr>
-    </w:p>
-    <w:p>
-      <w:pPr>
+        <w:widowControl w:val="1"/>
+        <w:spacing w:line="240" w:lineRule="auto"/>
+        <w:ind w:firstLine="0" w:left="-709"/>
+        <w:jc w:val="left"/>
+        <w:rPr>
+          <w:rFonts w:ascii="Times New Roman" w:hAnsi="Times New Roman"/>
+          <w:spacing w:val="0"/>
+          <w:sz w:val="16"/>
+        </w:rPr>
+      </w:pPr>
+    </w:p>
+    <w:p>
+      <w:pPr>
+        <w:widowControl w:val="1"/>
         <w:spacing w:line="240" w:lineRule="auto"/>
         <w:ind w:firstLine="0" w:left="-709"/>
         <w:jc w:val="left"/>
@@ -2511,18 +2590,20 @@
     </w:p>
     <w:p>
       <w:pPr>
-        <w:spacing w:line="240" w:lineRule="auto"/>
-        <w:ind w:firstLine="0" w:left="-709"/>
-        <w:jc w:val="left"/>
-        <w:rPr>
-          <w:rFonts w:ascii="Times New Roman" w:hAnsi="Times New Roman"/>
-          <w:spacing w:val="0"/>
-          <w:sz w:val="16"/>
-        </w:rPr>
-      </w:pPr>
-    </w:p>
-    <w:p>
-      <w:pPr>
+        <w:widowControl w:val="1"/>
+        <w:spacing w:line="240" w:lineRule="auto"/>
+        <w:ind w:firstLine="0" w:left="-709"/>
+        <w:jc w:val="left"/>
+        <w:rPr>
+          <w:rFonts w:ascii="Times New Roman" w:hAnsi="Times New Roman"/>
+          <w:spacing w:val="0"/>
+          <w:sz w:val="16"/>
+        </w:rPr>
+      </w:pPr>
+    </w:p>
+    <w:p>
+      <w:pPr>
+        <w:widowControl w:val="1"/>
         <w:spacing w:line="240" w:lineRule="auto"/>
         <w:ind w:firstLine="0" w:left="-709"/>
         <w:jc w:val="left"/>
@@ -2543,6 +2624,7 @@
     </w:p>
     <w:p>
       <w:pPr>
+        <w:widowControl w:val="1"/>
         <w:spacing w:line="240" w:lineRule="auto"/>
         <w:ind w:firstLine="0" w:left="-709"/>
         <w:jc w:val="left"/>
@@ -2563,30 +2645,33 @@
     </w:p>
     <w:p>
       <w:pPr>
-        <w:spacing w:line="240" w:lineRule="auto"/>
-        <w:ind w:firstLine="0" w:left="-709"/>
-        <w:jc w:val="left"/>
-        <w:rPr>
-          <w:rFonts w:ascii="Times New Roman" w:hAnsi="Times New Roman"/>
-          <w:spacing w:val="0"/>
-          <w:sz w:val="16"/>
-        </w:rPr>
-      </w:pPr>
-    </w:p>
-    <w:p>
-      <w:pPr>
-        <w:spacing w:line="240" w:lineRule="auto"/>
-        <w:ind w:firstLine="0" w:left="-709"/>
-        <w:jc w:val="left"/>
-        <w:rPr>
-          <w:rFonts w:ascii="Times New Roman" w:hAnsi="Times New Roman"/>
-          <w:spacing w:val="0"/>
-          <w:sz w:val="16"/>
-        </w:rPr>
-      </w:pPr>
-    </w:p>
-    <w:p>
-      <w:pPr>
+        <w:widowControl w:val="1"/>
+        <w:spacing w:line="240" w:lineRule="auto"/>
+        <w:ind w:firstLine="0" w:left="-709"/>
+        <w:jc w:val="left"/>
+        <w:rPr>
+          <w:rFonts w:ascii="Times New Roman" w:hAnsi="Times New Roman"/>
+          <w:spacing w:val="0"/>
+          <w:sz w:val="16"/>
+        </w:rPr>
+      </w:pPr>
+    </w:p>
+    <w:p>
+      <w:pPr>
+        <w:widowControl w:val="1"/>
+        <w:spacing w:line="240" w:lineRule="auto"/>
+        <w:ind w:firstLine="0" w:left="-709"/>
+        <w:jc w:val="left"/>
+        <w:rPr>
+          <w:rFonts w:ascii="Times New Roman" w:hAnsi="Times New Roman"/>
+          <w:spacing w:val="0"/>
+          <w:sz w:val="16"/>
+        </w:rPr>
+      </w:pPr>
+    </w:p>
+    <w:p>
+      <w:pPr>
+        <w:widowControl w:val="1"/>
         <w:spacing w:line="240" w:lineRule="auto"/>
         <w:ind w:firstLine="0" w:left="-709"/>
         <w:jc w:val="left"/>
@@ -2607,6 +2692,7 @@
     </w:p>
     <w:p>
       <w:pPr>
+        <w:widowControl w:val="1"/>
         <w:spacing w:line="240" w:lineRule="auto"/>
         <w:ind w:firstLine="0" w:left="-709"/>
         <w:jc w:val="left"/>
@@ -2627,18 +2713,20 @@
     </w:p>
     <w:p>
       <w:pPr>
-        <w:spacing w:line="240" w:lineRule="auto"/>
-        <w:ind w:firstLine="0" w:left="-709"/>
-        <w:jc w:val="left"/>
-        <w:rPr>
-          <w:rFonts w:ascii="Times New Roman" w:hAnsi="Times New Roman"/>
-          <w:spacing w:val="0"/>
-          <w:sz w:val="16"/>
-        </w:rPr>
-      </w:pPr>
-    </w:p>
-    <w:p>
-      <w:pPr>
+        <w:widowControl w:val="1"/>
+        <w:spacing w:line="240" w:lineRule="auto"/>
+        <w:ind w:firstLine="0" w:left="-709"/>
+        <w:jc w:val="left"/>
+        <w:rPr>
+          <w:rFonts w:ascii="Times New Roman" w:hAnsi="Times New Roman"/>
+          <w:spacing w:val="0"/>
+          <w:sz w:val="16"/>
+        </w:rPr>
+      </w:pPr>
+    </w:p>
+    <w:p>
+      <w:pPr>
+        <w:widowControl w:val="1"/>
         <w:spacing w:line="240" w:lineRule="auto"/>
         <w:ind w:firstLine="0" w:left="-709"/>
         <w:jc w:val="left"/>
@@ -2659,6 +2747,7 @@
     </w:p>
     <w:p>
       <w:pPr>
+        <w:widowControl w:val="1"/>
         <w:spacing w:line="240" w:lineRule="auto"/>
         <w:ind w:firstLine="0" w:left="-709"/>
         <w:jc w:val="left"/>
@@ -2679,6 +2768,7 @@
     </w:p>
     <w:p>
       <w:pPr>
+        <w:widowControl w:val="1"/>
         <w:spacing w:line="240" w:lineRule="auto"/>
         <w:ind w:firstLine="0" w:left="-709"/>
         <w:jc w:val="left"/>
@@ -2699,6 +2789,7 @@
     </w:p>
     <w:p>
       <w:pPr>
+        <w:widowControl w:val="1"/>
         <w:spacing w:line="240" w:lineRule="auto"/>
         <w:ind w:firstLine="0" w:left="-709"/>
         <w:jc w:val="left"/>
@@ -2719,6 +2810,7 @@
     </w:p>
     <w:p>
       <w:pPr>
+        <w:widowControl w:val="1"/>
         <w:spacing w:line="240" w:lineRule="auto"/>
         <w:ind w:firstLine="0" w:left="-709"/>
         <w:jc w:val="left"/>
@@ -2739,6 +2831,7 @@
     </w:p>
     <w:p>
       <w:pPr>
+        <w:widowControl w:val="1"/>
         <w:spacing w:line="240" w:lineRule="auto"/>
         <w:ind w:firstLine="0" w:left="-709"/>
         <w:jc w:val="left"/>
@@ -2759,6 +2852,7 @@
     </w:p>
     <w:p>
       <w:pPr>
+        <w:widowControl w:val="1"/>
         <w:spacing w:line="240" w:lineRule="auto"/>
         <w:ind w:firstLine="0" w:left="-709"/>
         <w:jc w:val="left"/>
@@ -2779,6 +2873,7 @@
     </w:p>
     <w:p>
       <w:pPr>
+        <w:widowControl w:val="1"/>
         <w:spacing w:line="240" w:lineRule="auto"/>
         <w:ind w:firstLine="0" w:left="-709"/>
         <w:jc w:val="left"/>
@@ -2799,6 +2894,7 @@
     </w:p>
     <w:p>
       <w:pPr>
+        <w:widowControl w:val="1"/>
         <w:spacing w:line="240" w:lineRule="auto"/>
         <w:ind w:firstLine="0" w:left="-709"/>
         <w:jc w:val="left"/>
@@ -2819,6 +2915,7 @@
     </w:p>
     <w:p>
       <w:pPr>
+        <w:widowControl w:val="1"/>
         <w:spacing w:line="240" w:lineRule="auto"/>
         <w:ind w:firstLine="0" w:left="-709"/>
         <w:jc w:val="left"/>
@@ -2839,6 +2936,7 @@
     </w:p>
     <w:p>
       <w:pPr>
+        <w:widowControl w:val="1"/>
         <w:spacing w:line="240" w:lineRule="auto"/>
         <w:ind w:firstLine="0" w:left="-709"/>
         <w:jc w:val="left"/>
@@ -2859,6 +2957,7 @@
     </w:p>
     <w:p>
       <w:pPr>
+        <w:widowControl w:val="1"/>
         <w:spacing w:line="240" w:lineRule="auto"/>
         <w:ind w:firstLine="0" w:left="-709"/>
         <w:jc w:val="left"/>
@@ -2879,6 +2978,7 @@
     </w:p>
     <w:p>
       <w:pPr>
+        <w:widowControl w:val="1"/>
         <w:spacing w:line="240" w:lineRule="auto"/>
         <w:ind w:firstLine="0" w:left="-709"/>
         <w:jc w:val="left"/>
@@ -2899,6 +2999,7 @@
     </w:p>
     <w:p>
       <w:pPr>
+        <w:widowControl w:val="1"/>
         <w:spacing w:line="240" w:lineRule="auto"/>
         <w:ind w:firstLine="0" w:left="-709"/>
         <w:jc w:val="left"/>
@@ -2919,18 +3020,20 @@
     </w:p>
     <w:p>
       <w:pPr>
-        <w:spacing w:line="240" w:lineRule="auto"/>
-        <w:ind w:firstLine="0" w:left="-709"/>
-        <w:jc w:val="left"/>
-        <w:rPr>
-          <w:rFonts w:ascii="Times New Roman" w:hAnsi="Times New Roman"/>
-          <w:spacing w:val="0"/>
-          <w:sz w:val="16"/>
-        </w:rPr>
-      </w:pPr>
-    </w:p>
-    <w:p>
-      <w:pPr>
+        <w:widowControl w:val="1"/>
+        <w:spacing w:line="240" w:lineRule="auto"/>
+        <w:ind w:firstLine="0" w:left="-709"/>
+        <w:jc w:val="left"/>
+        <w:rPr>
+          <w:rFonts w:ascii="Times New Roman" w:hAnsi="Times New Roman"/>
+          <w:spacing w:val="0"/>
+          <w:sz w:val="16"/>
+        </w:rPr>
+      </w:pPr>
+    </w:p>
+    <w:p>
+      <w:pPr>
+        <w:widowControl w:val="1"/>
         <w:spacing w:line="240" w:lineRule="auto"/>
         <w:ind w:firstLine="0" w:left="-709"/>
         <w:jc w:val="left"/>
@@ -2951,6 +3054,7 @@
     </w:p>
     <w:p>
       <w:pPr>
+        <w:widowControl w:val="1"/>
         <w:spacing w:line="240" w:lineRule="auto"/>
         <w:ind w:firstLine="0" w:left="-709"/>
         <w:jc w:val="left"/>
@@ -2971,6 +3075,7 @@
     </w:p>
     <w:p>
       <w:pPr>
+        <w:widowControl w:val="1"/>
         <w:spacing w:line="240" w:lineRule="auto"/>
         <w:ind w:firstLine="0" w:left="-709"/>
         <w:jc w:val="left"/>
@@ -2991,6 +3096,7 @@
     </w:p>
     <w:p>
       <w:pPr>
+        <w:widowControl w:val="1"/>
         <w:spacing w:line="240" w:lineRule="auto"/>
         <w:ind w:firstLine="0" w:left="-709"/>
         <w:jc w:val="left"/>
@@ -3011,6 +3117,7 @@
     </w:p>
     <w:p>
       <w:pPr>
+        <w:widowControl w:val="1"/>
         <w:spacing w:line="240" w:lineRule="auto"/>
         <w:ind w:firstLine="0" w:left="-709"/>
         <w:jc w:val="left"/>
@@ -3031,6 +3138,7 @@
     </w:p>
     <w:p>
       <w:pPr>
+        <w:widowControl w:val="1"/>
         <w:spacing w:line="240" w:lineRule="auto"/>
         <w:ind w:firstLine="0" w:left="-709"/>
         <w:jc w:val="left"/>
@@ -3051,6 +3159,7 @@
     </w:p>
     <w:p>
       <w:pPr>
+        <w:widowControl w:val="1"/>
         <w:spacing w:line="240" w:lineRule="auto"/>
         <w:ind w:firstLine="0" w:left="-709"/>
         <w:jc w:val="left"/>
@@ -3071,6 +3180,7 @@
     </w:p>
     <w:p>
       <w:pPr>
+        <w:widowControl w:val="1"/>
         <w:spacing w:line="240" w:lineRule="auto"/>
         <w:ind w:firstLine="0" w:left="-709"/>
         <w:jc w:val="left"/>
@@ -3091,6 +3201,7 @@
     </w:p>
     <w:p>
       <w:pPr>
+        <w:widowControl w:val="1"/>
         <w:spacing w:line="240" w:lineRule="auto"/>
         <w:ind w:firstLine="0" w:left="-709"/>
         <w:jc w:val="left"/>
@@ -3111,18 +3222,20 @@
     </w:p>
     <w:p>
       <w:pPr>
-        <w:spacing w:line="240" w:lineRule="auto"/>
-        <w:ind w:firstLine="0" w:left="-709"/>
-        <w:jc w:val="left"/>
-        <w:rPr>
-          <w:rFonts w:ascii="Times New Roman" w:hAnsi="Times New Roman"/>
-          <w:spacing w:val="0"/>
-          <w:sz w:val="16"/>
-        </w:rPr>
-      </w:pPr>
-    </w:p>
-    <w:p>
-      <w:pPr>
+        <w:widowControl w:val="1"/>
+        <w:spacing w:line="240" w:lineRule="auto"/>
+        <w:ind w:firstLine="0" w:left="-709"/>
+        <w:jc w:val="left"/>
+        <w:rPr>
+          <w:rFonts w:ascii="Times New Roman" w:hAnsi="Times New Roman"/>
+          <w:spacing w:val="0"/>
+          <w:sz w:val="16"/>
+        </w:rPr>
+      </w:pPr>
+    </w:p>
+    <w:p>
+      <w:pPr>
+        <w:widowControl w:val="1"/>
         <w:spacing w:line="240" w:lineRule="auto"/>
         <w:ind w:firstLine="0" w:left="-709"/>
         <w:jc w:val="left"/>
@@ -3143,6 +3256,7 @@
     </w:p>
     <w:p>
       <w:pPr>
+        <w:widowControl w:val="1"/>
         <w:spacing w:line="240" w:lineRule="auto"/>
         <w:ind w:firstLine="0" w:left="-709"/>
         <w:jc w:val="left"/>
@@ -3163,30 +3277,33 @@
     </w:p>
     <w:p>
       <w:pPr>
-        <w:spacing w:line="240" w:lineRule="auto"/>
-        <w:ind w:firstLine="0" w:left="-709"/>
-        <w:jc w:val="left"/>
-        <w:rPr>
-          <w:rFonts w:ascii="Times New Roman" w:hAnsi="Times New Roman"/>
-          <w:spacing w:val="0"/>
-          <w:sz w:val="16"/>
-        </w:rPr>
-      </w:pPr>
-    </w:p>
-    <w:p>
-      <w:pPr>
-        <w:spacing w:line="240" w:lineRule="auto"/>
-        <w:ind w:firstLine="0" w:left="-709"/>
-        <w:jc w:val="left"/>
-        <w:rPr>
-          <w:rFonts w:ascii="Times New Roman" w:hAnsi="Times New Roman"/>
-          <w:spacing w:val="0"/>
-          <w:sz w:val="16"/>
-        </w:rPr>
-      </w:pPr>
-    </w:p>
-    <w:p>
-      <w:pPr>
+        <w:widowControl w:val="1"/>
+        <w:spacing w:line="240" w:lineRule="auto"/>
+        <w:ind w:firstLine="0" w:left="-709"/>
+        <w:jc w:val="left"/>
+        <w:rPr>
+          <w:rFonts w:ascii="Times New Roman" w:hAnsi="Times New Roman"/>
+          <w:spacing w:val="0"/>
+          <w:sz w:val="16"/>
+        </w:rPr>
+      </w:pPr>
+    </w:p>
+    <w:p>
+      <w:pPr>
+        <w:widowControl w:val="1"/>
+        <w:spacing w:line="240" w:lineRule="auto"/>
+        <w:ind w:firstLine="0" w:left="-709"/>
+        <w:jc w:val="left"/>
+        <w:rPr>
+          <w:rFonts w:ascii="Times New Roman" w:hAnsi="Times New Roman"/>
+          <w:spacing w:val="0"/>
+          <w:sz w:val="16"/>
+        </w:rPr>
+      </w:pPr>
+    </w:p>
+    <w:p>
+      <w:pPr>
+        <w:widowControl w:val="1"/>
         <w:spacing w:line="240" w:lineRule="auto"/>
         <w:ind w:firstLine="0" w:left="-709"/>
         <w:jc w:val="left"/>
@@ -3207,6 +3324,7 @@
     </w:p>
     <w:p>
       <w:pPr>
+        <w:widowControl w:val="1"/>
         <w:spacing w:line="240" w:lineRule="auto"/>
         <w:ind w:firstLine="0" w:left="-709"/>
         <w:jc w:val="left"/>
@@ -3227,18 +3345,20 @@
     </w:p>
     <w:p>
       <w:pPr>
-        <w:spacing w:line="240" w:lineRule="auto"/>
-        <w:ind w:firstLine="0" w:left="-709"/>
-        <w:jc w:val="left"/>
-        <w:rPr>
-          <w:rFonts w:ascii="Times New Roman" w:hAnsi="Times New Roman"/>
-          <w:spacing w:val="0"/>
-          <w:sz w:val="16"/>
-        </w:rPr>
-      </w:pPr>
-    </w:p>
-    <w:p>
-      <w:pPr>
+        <w:widowControl w:val="1"/>
+        <w:spacing w:line="240" w:lineRule="auto"/>
+        <w:ind w:firstLine="0" w:left="-709"/>
+        <w:jc w:val="left"/>
+        <w:rPr>
+          <w:rFonts w:ascii="Times New Roman" w:hAnsi="Times New Roman"/>
+          <w:spacing w:val="0"/>
+          <w:sz w:val="16"/>
+        </w:rPr>
+      </w:pPr>
+    </w:p>
+    <w:p>
+      <w:pPr>
+        <w:widowControl w:val="1"/>
         <w:spacing w:line="240" w:lineRule="auto"/>
         <w:ind w:firstLine="0" w:left="-709"/>
         <w:jc w:val="left"/>
@@ -3259,6 +3379,7 @@
     </w:p>
     <w:p>
       <w:pPr>
+        <w:widowControl w:val="1"/>
         <w:spacing w:line="240" w:lineRule="auto"/>
         <w:ind w:firstLine="0" w:left="-709"/>
         <w:jc w:val="left"/>
@@ -3279,6 +3400,7 @@
     </w:p>
     <w:p>
       <w:pPr>
+        <w:widowControl w:val="1"/>
         <w:spacing w:line="240" w:lineRule="auto"/>
         <w:ind w:firstLine="0" w:left="-709"/>
         <w:jc w:val="left"/>
@@ -3299,6 +3421,7 @@
     </w:p>
     <w:p>
       <w:pPr>
+        <w:widowControl w:val="1"/>
         <w:spacing w:line="240" w:lineRule="auto"/>
         <w:ind w:firstLine="0" w:left="-709"/>
         <w:jc w:val="left"/>
@@ -3319,6 +3442,7 @@
     </w:p>
     <w:p>
       <w:pPr>
+        <w:widowControl w:val="1"/>
         <w:spacing w:line="240" w:lineRule="auto"/>
         <w:ind w:firstLine="0" w:left="-709"/>
         <w:jc w:val="left"/>
@@ -3339,6 +3463,7 @@
     </w:p>
     <w:p>
       <w:pPr>
+        <w:widowControl w:val="1"/>
         <w:spacing w:line="240" w:lineRule="auto"/>
         <w:ind w:firstLine="0" w:left="-709"/>
         <w:jc w:val="left"/>
@@ -3359,18 +3484,20 @@
     </w:p>
     <w:p>
       <w:pPr>
-        <w:spacing w:line="240" w:lineRule="auto"/>
-        <w:ind w:firstLine="0" w:left="-709"/>
-        <w:jc w:val="left"/>
-        <w:rPr>
-          <w:rFonts w:ascii="Times New Roman" w:hAnsi="Times New Roman"/>
-          <w:spacing w:val="0"/>
-          <w:sz w:val="16"/>
-        </w:rPr>
-      </w:pPr>
-    </w:p>
-    <w:p>
-      <w:pPr>
+        <w:widowControl w:val="1"/>
+        <w:spacing w:line="240" w:lineRule="auto"/>
+        <w:ind w:firstLine="0" w:left="-709"/>
+        <w:jc w:val="left"/>
+        <w:rPr>
+          <w:rFonts w:ascii="Times New Roman" w:hAnsi="Times New Roman"/>
+          <w:spacing w:val="0"/>
+          <w:sz w:val="16"/>
+        </w:rPr>
+      </w:pPr>
+    </w:p>
+    <w:p>
+      <w:pPr>
+        <w:widowControl w:val="1"/>
         <w:spacing w:line="240" w:lineRule="auto"/>
         <w:ind w:firstLine="0" w:left="-709"/>
         <w:jc w:val="left"/>
@@ -3391,6 +3518,7 @@
     </w:p>
     <w:p>
       <w:pPr>
+        <w:widowControl w:val="1"/>
         <w:spacing w:line="240" w:lineRule="auto"/>
         <w:ind w:firstLine="0" w:left="-709"/>
         <w:jc w:val="left"/>
@@ -3411,18 +3539,20 @@
     </w:p>
     <w:p>
       <w:pPr>
-        <w:spacing w:line="240" w:lineRule="auto"/>
-        <w:ind w:firstLine="0" w:left="-709"/>
-        <w:jc w:val="left"/>
-        <w:rPr>
-          <w:rFonts w:ascii="Times New Roman" w:hAnsi="Times New Roman"/>
-          <w:spacing w:val="0"/>
-          <w:sz w:val="16"/>
-        </w:rPr>
-      </w:pPr>
-    </w:p>
-    <w:p>
-      <w:pPr>
+        <w:widowControl w:val="1"/>
+        <w:spacing w:line="240" w:lineRule="auto"/>
+        <w:ind w:firstLine="0" w:left="-709"/>
+        <w:jc w:val="left"/>
+        <w:rPr>
+          <w:rFonts w:ascii="Times New Roman" w:hAnsi="Times New Roman"/>
+          <w:spacing w:val="0"/>
+          <w:sz w:val="16"/>
+        </w:rPr>
+      </w:pPr>
+    </w:p>
+    <w:p>
+      <w:pPr>
+        <w:widowControl w:val="1"/>
         <w:spacing w:line="240" w:lineRule="auto"/>
         <w:ind w:firstLine="0" w:left="-709"/>
         <w:jc w:val="left"/>
@@ -3443,6 +3573,7 @@
     </w:p>
     <w:p>
       <w:pPr>
+        <w:widowControl w:val="1"/>
         <w:spacing w:line="240" w:lineRule="auto"/>
         <w:ind w:firstLine="0" w:left="-709"/>
         <w:jc w:val="left"/>
@@ -3463,30 +3594,33 @@
     </w:p>
     <w:p>
       <w:pPr>
-        <w:spacing w:line="240" w:lineRule="auto"/>
-        <w:ind w:firstLine="0" w:left="-709"/>
-        <w:jc w:val="left"/>
-        <w:rPr>
-          <w:rFonts w:ascii="Times New Roman" w:hAnsi="Times New Roman"/>
-          <w:spacing w:val="0"/>
-          <w:sz w:val="16"/>
-        </w:rPr>
-      </w:pPr>
-    </w:p>
-    <w:p>
-      <w:pPr>
-        <w:spacing w:line="240" w:lineRule="auto"/>
-        <w:ind w:firstLine="0" w:left="-709"/>
-        <w:jc w:val="left"/>
-        <w:rPr>
-          <w:rFonts w:ascii="Times New Roman" w:hAnsi="Times New Roman"/>
-          <w:spacing w:val="0"/>
-          <w:sz w:val="16"/>
-        </w:rPr>
-      </w:pPr>
-    </w:p>
-    <w:p>
-      <w:pPr>
+        <w:widowControl w:val="1"/>
+        <w:spacing w:line="240" w:lineRule="auto"/>
+        <w:ind w:firstLine="0" w:left="-709"/>
+        <w:jc w:val="left"/>
+        <w:rPr>
+          <w:rFonts w:ascii="Times New Roman" w:hAnsi="Times New Roman"/>
+          <w:spacing w:val="0"/>
+          <w:sz w:val="16"/>
+        </w:rPr>
+      </w:pPr>
+    </w:p>
+    <w:p>
+      <w:pPr>
+        <w:widowControl w:val="1"/>
+        <w:spacing w:line="240" w:lineRule="auto"/>
+        <w:ind w:firstLine="0" w:left="-709"/>
+        <w:jc w:val="left"/>
+        <w:rPr>
+          <w:rFonts w:ascii="Times New Roman" w:hAnsi="Times New Roman"/>
+          <w:spacing w:val="0"/>
+          <w:sz w:val="16"/>
+        </w:rPr>
+      </w:pPr>
+    </w:p>
+    <w:p>
+      <w:pPr>
+        <w:widowControl w:val="1"/>
         <w:spacing w:line="240" w:lineRule="auto"/>
         <w:ind w:firstLine="0" w:left="-709"/>
         <w:jc w:val="left"/>
@@ -3507,6 +3641,7 @@
     </w:p>
     <w:p>
       <w:pPr>
+        <w:widowControl w:val="1"/>
         <w:spacing w:line="240" w:lineRule="auto"/>
         <w:ind w:firstLine="0" w:left="-709"/>
         <w:jc w:val="left"/>
@@ -3527,18 +3662,20 @@
     </w:p>
     <w:p>
       <w:pPr>
-        <w:spacing w:line="240" w:lineRule="auto"/>
-        <w:ind w:firstLine="0" w:left="-709"/>
-        <w:jc w:val="left"/>
-        <w:rPr>
-          <w:rFonts w:ascii="Times New Roman" w:hAnsi="Times New Roman"/>
-          <w:spacing w:val="0"/>
-          <w:sz w:val="16"/>
-        </w:rPr>
-      </w:pPr>
-    </w:p>
-    <w:p>
-      <w:pPr>
+        <w:widowControl w:val="1"/>
+        <w:spacing w:line="240" w:lineRule="auto"/>
+        <w:ind w:firstLine="0" w:left="-709"/>
+        <w:jc w:val="left"/>
+        <w:rPr>
+          <w:rFonts w:ascii="Times New Roman" w:hAnsi="Times New Roman"/>
+          <w:spacing w:val="0"/>
+          <w:sz w:val="16"/>
+        </w:rPr>
+      </w:pPr>
+    </w:p>
+    <w:p>
+      <w:pPr>
+        <w:widowControl w:val="1"/>
         <w:spacing w:line="240" w:lineRule="auto"/>
         <w:ind w:firstLine="0" w:left="-709"/>
         <w:jc w:val="left"/>
@@ -3559,6 +3696,7 @@
     </w:p>
     <w:p>
       <w:pPr>
+        <w:widowControl w:val="1"/>
         <w:spacing w:line="240" w:lineRule="auto"/>
         <w:ind w:firstLine="0" w:left="-709"/>
         <w:jc w:val="left"/>
@@ -3579,6 +3717,7 @@
     </w:p>
     <w:p>
       <w:pPr>
+        <w:widowControl w:val="1"/>
         <w:spacing w:line="240" w:lineRule="auto"/>
         <w:ind w:firstLine="0" w:left="-709"/>
         <w:jc w:val="left"/>
@@ -3599,6 +3738,7 @@
     </w:p>
     <w:p>
       <w:pPr>
+        <w:widowControl w:val="1"/>
         <w:spacing w:line="240" w:lineRule="auto"/>
         <w:ind w:firstLine="0" w:left="-709"/>
         <w:jc w:val="left"/>
@@ -3619,6 +3759,7 @@
     </w:p>
     <w:p>
       <w:pPr>
+        <w:widowControl w:val="1"/>
         <w:spacing w:line="240" w:lineRule="auto"/>
         <w:ind w:firstLine="0" w:left="-709"/>
         <w:jc w:val="left"/>
@@ -3639,6 +3780,7 @@
     </w:p>
     <w:p>
       <w:pPr>
+        <w:widowControl w:val="1"/>
         <w:spacing w:line="240" w:lineRule="auto"/>
         <w:ind w:firstLine="0" w:left="-709"/>
         <w:jc w:val="left"/>
@@ -3659,6 +3801,7 @@
     </w:p>
     <w:p>
       <w:pPr>
+        <w:widowControl w:val="1"/>
         <w:spacing w:line="240" w:lineRule="auto"/>
         <w:ind w:firstLine="0" w:left="-709"/>
         <w:jc w:val="left"/>
@@ -3679,6 +3822,7 @@
     </w:p>
     <w:p>
       <w:pPr>
+        <w:widowControl w:val="1"/>
         <w:spacing w:line="240" w:lineRule="auto"/>
         <w:ind w:firstLine="0" w:left="-709"/>
         <w:jc w:val="left"/>
@@ -3699,6 +3843,7 @@
     </w:p>
     <w:p>
       <w:pPr>
+        <w:widowControl w:val="1"/>
         <w:spacing w:line="240" w:lineRule="auto"/>
         <w:ind w:firstLine="0" w:left="-709"/>
         <w:jc w:val="left"/>
@@ -3719,18 +3864,20 @@
     </w:p>
     <w:p>
       <w:pPr>
-        <w:spacing w:line="240" w:lineRule="auto"/>
-        <w:ind w:firstLine="0" w:left="-709"/>
-        <w:jc w:val="left"/>
-        <w:rPr>
-          <w:rFonts w:ascii="Times New Roman" w:hAnsi="Times New Roman"/>
-          <w:spacing w:val="0"/>
-          <w:sz w:val="16"/>
-        </w:rPr>
-      </w:pPr>
-    </w:p>
-    <w:p>
-      <w:pPr>
+        <w:widowControl w:val="1"/>
+        <w:spacing w:line="240" w:lineRule="auto"/>
+        <w:ind w:firstLine="0" w:left="-709"/>
+        <w:jc w:val="left"/>
+        <w:rPr>
+          <w:rFonts w:ascii="Times New Roman" w:hAnsi="Times New Roman"/>
+          <w:spacing w:val="0"/>
+          <w:sz w:val="16"/>
+        </w:rPr>
+      </w:pPr>
+    </w:p>
+    <w:p>
+      <w:pPr>
+        <w:widowControl w:val="1"/>
         <w:spacing w:line="240" w:lineRule="auto"/>
         <w:ind w:firstLine="0" w:left="-709"/>
         <w:jc w:val="left"/>
@@ -3751,6 +3898,7 @@
     </w:p>
     <w:p>
       <w:pPr>
+        <w:widowControl w:val="1"/>
         <w:spacing w:line="240" w:lineRule="auto"/>
         <w:ind w:firstLine="0" w:left="-709"/>
         <w:jc w:val="left"/>
@@ -3771,6 +3919,7 @@
     </w:p>
     <w:p>
       <w:pPr>
+        <w:widowControl w:val="1"/>
         <w:spacing w:line="240" w:lineRule="auto"/>
         <w:ind w:firstLine="0" w:left="-709"/>
         <w:jc w:val="left"/>
@@ -3791,6 +3940,7 @@
     </w:p>
     <w:p>
       <w:pPr>
+        <w:widowControl w:val="1"/>
         <w:spacing w:line="240" w:lineRule="auto"/>
         <w:ind w:firstLine="0" w:left="-709"/>
         <w:jc w:val="left"/>
@@ -3811,18 +3961,20 @@
     </w:p>
     <w:p>
       <w:pPr>
-        <w:spacing w:line="240" w:lineRule="auto"/>
-        <w:ind w:firstLine="0" w:left="-709"/>
-        <w:jc w:val="left"/>
-        <w:rPr>
-          <w:rFonts w:ascii="Times New Roman" w:hAnsi="Times New Roman"/>
-          <w:spacing w:val="0"/>
-          <w:sz w:val="16"/>
-        </w:rPr>
-      </w:pPr>
-    </w:p>
-    <w:p>
-      <w:pPr>
+        <w:widowControl w:val="1"/>
+        <w:spacing w:line="240" w:lineRule="auto"/>
+        <w:ind w:firstLine="0" w:left="-709"/>
+        <w:jc w:val="left"/>
+        <w:rPr>
+          <w:rFonts w:ascii="Times New Roman" w:hAnsi="Times New Roman"/>
+          <w:spacing w:val="0"/>
+          <w:sz w:val="16"/>
+        </w:rPr>
+      </w:pPr>
+    </w:p>
+    <w:p>
+      <w:pPr>
+        <w:widowControl w:val="1"/>
         <w:spacing w:line="240" w:lineRule="auto"/>
         <w:ind w:firstLine="0" w:left="-709"/>
         <w:jc w:val="left"/>
@@ -3843,6 +3995,7 @@
     </w:p>
     <w:p>
       <w:pPr>
+        <w:widowControl w:val="1"/>
         <w:spacing w:line="240" w:lineRule="auto"/>
         <w:ind w:firstLine="0" w:left="-709"/>
         <w:jc w:val="left"/>
@@ -3863,6 +4016,7 @@
     </w:p>
     <w:p>
       <w:pPr>
+        <w:widowControl w:val="1"/>
         <w:spacing w:line="240" w:lineRule="auto"/>
         <w:ind w:firstLine="0" w:left="-709"/>
         <w:jc w:val="left"/>
@@ -3883,6 +4037,7 @@
     </w:p>
     <w:p>
       <w:pPr>
+        <w:widowControl w:val="1"/>
         <w:spacing w:line="240" w:lineRule="auto"/>
         <w:ind w:firstLine="0" w:left="-709"/>
         <w:jc w:val="left"/>
@@ -3903,6 +4058,7 @@
     </w:p>
     <w:p>
       <w:pPr>
+        <w:widowControl w:val="1"/>
         <w:spacing w:line="240" w:lineRule="auto"/>
         <w:ind w:firstLine="0" w:left="-709"/>
         <w:jc w:val="left"/>
@@ -3923,6 +4079,7 @@
     </w:p>
     <w:p>
       <w:pPr>
+        <w:widowControl w:val="1"/>
         <w:spacing w:line="240" w:lineRule="auto"/>
         <w:ind w:firstLine="0" w:left="-709"/>
         <w:jc w:val="left"/>
@@ -3943,30 +4100,33 @@
     </w:p>
     <w:p>
       <w:pPr>
-        <w:spacing w:line="240" w:lineRule="auto"/>
-        <w:ind w:firstLine="0" w:left="-709"/>
-        <w:jc w:val="left"/>
-        <w:rPr>
-          <w:rFonts w:ascii="Times New Roman" w:hAnsi="Times New Roman"/>
-          <w:spacing w:val="0"/>
-          <w:sz w:val="16"/>
-        </w:rPr>
-      </w:pPr>
-    </w:p>
-    <w:p>
-      <w:pPr>
-        <w:spacing w:line="240" w:lineRule="auto"/>
-        <w:ind w:firstLine="0" w:left="-709"/>
-        <w:jc w:val="left"/>
-        <w:rPr>
-          <w:rFonts w:ascii="Times New Roman" w:hAnsi="Times New Roman"/>
-          <w:spacing w:val="0"/>
-          <w:sz w:val="16"/>
-        </w:rPr>
-      </w:pPr>
-    </w:p>
-    <w:p>
-      <w:pPr>
+        <w:widowControl w:val="1"/>
+        <w:spacing w:line="240" w:lineRule="auto"/>
+        <w:ind w:firstLine="0" w:left="-709"/>
+        <w:jc w:val="left"/>
+        <w:rPr>
+          <w:rFonts w:ascii="Times New Roman" w:hAnsi="Times New Roman"/>
+          <w:spacing w:val="0"/>
+          <w:sz w:val="16"/>
+        </w:rPr>
+      </w:pPr>
+    </w:p>
+    <w:p>
+      <w:pPr>
+        <w:widowControl w:val="1"/>
+        <w:spacing w:line="240" w:lineRule="auto"/>
+        <w:ind w:firstLine="0" w:left="-709"/>
+        <w:jc w:val="left"/>
+        <w:rPr>
+          <w:rFonts w:ascii="Times New Roman" w:hAnsi="Times New Roman"/>
+          <w:spacing w:val="0"/>
+          <w:sz w:val="16"/>
+        </w:rPr>
+      </w:pPr>
+    </w:p>
+    <w:p>
+      <w:pPr>
+        <w:widowControl w:val="1"/>
         <w:spacing w:line="240" w:lineRule="auto"/>
         <w:ind w:firstLine="0" w:left="-709"/>
         <w:jc w:val="left"/>
@@ -3987,6 +4147,7 @@
     </w:p>
     <w:p>
       <w:pPr>
+        <w:widowControl w:val="1"/>
         <w:spacing w:line="240" w:lineRule="auto"/>
         <w:ind w:firstLine="0" w:left="-709"/>
         <w:jc w:val="left"/>
@@ -4007,18 +4168,20 @@
     </w:p>
     <w:p>
       <w:pPr>
-        <w:spacing w:line="240" w:lineRule="auto"/>
-        <w:ind w:firstLine="0" w:left="-709"/>
-        <w:jc w:val="left"/>
-        <w:rPr>
-          <w:rFonts w:ascii="Times New Roman" w:hAnsi="Times New Roman"/>
-          <w:spacing w:val="0"/>
-          <w:sz w:val="16"/>
-        </w:rPr>
-      </w:pPr>
-    </w:p>
-    <w:p>
-      <w:pPr>
+        <w:widowControl w:val="1"/>
+        <w:spacing w:line="240" w:lineRule="auto"/>
+        <w:ind w:firstLine="0" w:left="-709"/>
+        <w:jc w:val="left"/>
+        <w:rPr>
+          <w:rFonts w:ascii="Times New Roman" w:hAnsi="Times New Roman"/>
+          <w:spacing w:val="0"/>
+          <w:sz w:val="16"/>
+        </w:rPr>
+      </w:pPr>
+    </w:p>
+    <w:p>
+      <w:pPr>
+        <w:widowControl w:val="1"/>
         <w:spacing w:line="240" w:lineRule="auto"/>
         <w:ind w:firstLine="0" w:left="-709"/>
         <w:jc w:val="left"/>
@@ -4039,6 +4202,7 @@
     </w:p>
     <w:p>
       <w:pPr>
+        <w:widowControl w:val="1"/>
         <w:spacing w:line="240" w:lineRule="auto"/>
         <w:ind w:firstLine="0" w:left="-709"/>
         <w:jc w:val="left"/>
@@ -4059,18 +4223,20 @@
     </w:p>
     <w:p>
       <w:pPr>
-        <w:spacing w:line="240" w:lineRule="auto"/>
-        <w:ind w:firstLine="0" w:left="-709"/>
-        <w:jc w:val="left"/>
-        <w:rPr>
-          <w:rFonts w:ascii="Times New Roman" w:hAnsi="Times New Roman"/>
-          <w:spacing w:val="0"/>
-          <w:sz w:val="16"/>
-        </w:rPr>
-      </w:pPr>
-    </w:p>
-    <w:p>
-      <w:pPr>
+        <w:widowControl w:val="1"/>
+        <w:spacing w:line="240" w:lineRule="auto"/>
+        <w:ind w:firstLine="0" w:left="-709"/>
+        <w:jc w:val="left"/>
+        <w:rPr>
+          <w:rFonts w:ascii="Times New Roman" w:hAnsi="Times New Roman"/>
+          <w:spacing w:val="0"/>
+          <w:sz w:val="16"/>
+        </w:rPr>
+      </w:pPr>
+    </w:p>
+    <w:p>
+      <w:pPr>
+        <w:widowControl w:val="1"/>
         <w:spacing w:line="240" w:lineRule="auto"/>
         <w:ind w:firstLine="0" w:left="-709"/>
         <w:jc w:val="left"/>
@@ -4091,6 +4257,7 @@
     </w:p>
     <w:p>
       <w:pPr>
+        <w:widowControl w:val="1"/>
         <w:spacing w:line="240" w:lineRule="auto"/>
         <w:ind w:firstLine="0" w:left="-709"/>
         <w:jc w:val="left"/>
@@ -4111,18 +4278,20 @@
     </w:p>
     <w:p>
       <w:pPr>
-        <w:spacing w:line="240" w:lineRule="auto"/>
-        <w:ind w:firstLine="0" w:left="-709"/>
-        <w:jc w:val="left"/>
-        <w:rPr>
-          <w:rFonts w:ascii="Times New Roman" w:hAnsi="Times New Roman"/>
-          <w:spacing w:val="0"/>
-          <w:sz w:val="16"/>
-        </w:rPr>
-      </w:pPr>
-    </w:p>
-    <w:p>
-      <w:pPr>
+        <w:widowControl w:val="1"/>
+        <w:spacing w:line="240" w:lineRule="auto"/>
+        <w:ind w:firstLine="0" w:left="-709"/>
+        <w:jc w:val="left"/>
+        <w:rPr>
+          <w:rFonts w:ascii="Times New Roman" w:hAnsi="Times New Roman"/>
+          <w:spacing w:val="0"/>
+          <w:sz w:val="16"/>
+        </w:rPr>
+      </w:pPr>
+    </w:p>
+    <w:p>
+      <w:pPr>
+        <w:widowControl w:val="1"/>
         <w:spacing w:line="240" w:lineRule="auto"/>
         <w:ind w:firstLine="0" w:left="-709"/>
         <w:jc w:val="left"/>
@@ -4143,6 +4312,7 @@
     </w:p>
     <w:p>
       <w:pPr>
+        <w:widowControl w:val="1"/>
         <w:spacing w:line="240" w:lineRule="auto"/>
         <w:ind w:firstLine="0" w:left="-709"/>
         <w:jc w:val="left"/>
@@ -4163,18 +4333,20 @@
     </w:p>
     <w:p>
       <w:pPr>
-        <w:spacing w:line="240" w:lineRule="auto"/>
-        <w:ind w:firstLine="0" w:left="-709"/>
-        <w:jc w:val="left"/>
-        <w:rPr>
-          <w:rFonts w:ascii="Times New Roman" w:hAnsi="Times New Roman"/>
-          <w:spacing w:val="0"/>
-          <w:sz w:val="16"/>
-        </w:rPr>
-      </w:pPr>
-    </w:p>
-    <w:p>
-      <w:pPr>
+        <w:widowControl w:val="1"/>
+        <w:spacing w:line="240" w:lineRule="auto"/>
+        <w:ind w:firstLine="0" w:left="-709"/>
+        <w:jc w:val="left"/>
+        <w:rPr>
+          <w:rFonts w:ascii="Times New Roman" w:hAnsi="Times New Roman"/>
+          <w:spacing w:val="0"/>
+          <w:sz w:val="16"/>
+        </w:rPr>
+      </w:pPr>
+    </w:p>
+    <w:p>
+      <w:pPr>
+        <w:widowControl w:val="1"/>
         <w:spacing w:line="240" w:lineRule="auto"/>
         <w:ind w:firstLine="0" w:left="-709"/>
         <w:jc w:val="left"/>
@@ -4195,6 +4367,7 @@
     </w:p>
     <w:p>
       <w:pPr>
+        <w:widowControl w:val="1"/>
         <w:spacing w:line="240" w:lineRule="auto"/>
         <w:ind w:firstLine="0" w:left="-709"/>
         <w:jc w:val="left"/>
@@ -4215,18 +4388,20 @@
     </w:p>
     <w:p>
       <w:pPr>
-        <w:spacing w:line="240" w:lineRule="auto"/>
-        <w:ind w:firstLine="0" w:left="-709"/>
-        <w:jc w:val="left"/>
-        <w:rPr>
-          <w:rFonts w:ascii="Times New Roman" w:hAnsi="Times New Roman"/>
-          <w:spacing w:val="0"/>
-          <w:sz w:val="16"/>
-        </w:rPr>
-      </w:pPr>
-    </w:p>
-    <w:p>
-      <w:pPr>
+        <w:widowControl w:val="1"/>
+        <w:spacing w:line="240" w:lineRule="auto"/>
+        <w:ind w:firstLine="0" w:left="-709"/>
+        <w:jc w:val="left"/>
+        <w:rPr>
+          <w:rFonts w:ascii="Times New Roman" w:hAnsi="Times New Roman"/>
+          <w:spacing w:val="0"/>
+          <w:sz w:val="16"/>
+        </w:rPr>
+      </w:pPr>
+    </w:p>
+    <w:p>
+      <w:pPr>
+        <w:widowControl w:val="1"/>
         <w:spacing w:line="240" w:lineRule="auto"/>
         <w:ind w:firstLine="0" w:left="-709"/>
         <w:jc w:val="left"/>
@@ -4247,18 +4422,20 @@
     </w:p>
     <w:p>
       <w:pPr>
-        <w:spacing w:line="240" w:lineRule="auto"/>
-        <w:ind w:firstLine="0" w:left="-709"/>
-        <w:jc w:val="left"/>
-        <w:rPr>
-          <w:rFonts w:ascii="Times New Roman" w:hAnsi="Times New Roman"/>
-          <w:spacing w:val="0"/>
-          <w:sz w:val="16"/>
-        </w:rPr>
-      </w:pPr>
-    </w:p>
-    <w:p>
-      <w:pPr>
+        <w:widowControl w:val="1"/>
+        <w:spacing w:line="240" w:lineRule="auto"/>
+        <w:ind w:firstLine="0" w:left="-709"/>
+        <w:jc w:val="left"/>
+        <w:rPr>
+          <w:rFonts w:ascii="Times New Roman" w:hAnsi="Times New Roman"/>
+          <w:spacing w:val="0"/>
+          <w:sz w:val="16"/>
+        </w:rPr>
+      </w:pPr>
+    </w:p>
+    <w:p>
+      <w:pPr>
+        <w:widowControl w:val="1"/>
         <w:spacing w:line="240" w:lineRule="auto"/>
         <w:ind w:firstLine="0" w:left="-709"/>
         <w:jc w:val="left"/>
@@ -4279,18 +4456,20 @@
     </w:p>
     <w:p>
       <w:pPr>
-        <w:spacing w:line="240" w:lineRule="auto"/>
-        <w:ind w:firstLine="0" w:left="-709"/>
-        <w:jc w:val="left"/>
-        <w:rPr>
-          <w:rFonts w:ascii="Times New Roman" w:hAnsi="Times New Roman"/>
-          <w:spacing w:val="0"/>
-          <w:sz w:val="16"/>
-        </w:rPr>
-      </w:pPr>
-    </w:p>
-    <w:p>
-      <w:pPr>
+        <w:widowControl w:val="1"/>
+        <w:spacing w:line="240" w:lineRule="auto"/>
+        <w:ind w:firstLine="0" w:left="-709"/>
+        <w:jc w:val="left"/>
+        <w:rPr>
+          <w:rFonts w:ascii="Times New Roman" w:hAnsi="Times New Roman"/>
+          <w:spacing w:val="0"/>
+          <w:sz w:val="16"/>
+        </w:rPr>
+      </w:pPr>
+    </w:p>
+    <w:p>
+      <w:pPr>
+        <w:widowControl w:val="1"/>
         <w:spacing w:line="240" w:lineRule="auto"/>
         <w:ind w:firstLine="0" w:left="-709"/>
         <w:jc w:val="left"/>
@@ -4311,18 +4490,20 @@
     </w:p>
     <w:p>
       <w:pPr>
-        <w:spacing w:line="240" w:lineRule="auto"/>
-        <w:ind w:firstLine="0" w:left="-709"/>
-        <w:jc w:val="left"/>
-        <w:rPr>
-          <w:rFonts w:ascii="Times New Roman" w:hAnsi="Times New Roman"/>
-          <w:spacing w:val="0"/>
-          <w:sz w:val="16"/>
-        </w:rPr>
-      </w:pPr>
-    </w:p>
-    <w:p>
-      <w:pPr>
+        <w:widowControl w:val="1"/>
+        <w:spacing w:line="240" w:lineRule="auto"/>
+        <w:ind w:firstLine="0" w:left="-709"/>
+        <w:jc w:val="left"/>
+        <w:rPr>
+          <w:rFonts w:ascii="Times New Roman" w:hAnsi="Times New Roman"/>
+          <w:spacing w:val="0"/>
+          <w:sz w:val="16"/>
+        </w:rPr>
+      </w:pPr>
+    </w:p>
+    <w:p>
+      <w:pPr>
+        <w:widowControl w:val="1"/>
         <w:spacing w:line="240" w:lineRule="auto"/>
         <w:ind w:firstLine="0" w:left="-709"/>
         <w:jc w:val="left"/>
@@ -4343,6 +4524,7 @@
     </w:p>
     <w:p>
       <w:pPr>
+        <w:widowControl w:val="1"/>
         <w:spacing w:line="240" w:lineRule="auto"/>
         <w:ind w:firstLine="0" w:left="-709"/>
         <w:jc w:val="left"/>
@@ -4363,18 +4545,20 @@
     </w:p>
     <w:p>
       <w:pPr>
-        <w:spacing w:line="240" w:lineRule="auto"/>
-        <w:ind w:firstLine="0" w:left="-709"/>
-        <w:jc w:val="left"/>
-        <w:rPr>
-          <w:rFonts w:ascii="Times New Roman" w:hAnsi="Times New Roman"/>
-          <w:spacing w:val="0"/>
-          <w:sz w:val="16"/>
-        </w:rPr>
-      </w:pPr>
-    </w:p>
-    <w:p>
-      <w:pPr>
+        <w:widowControl w:val="1"/>
+        <w:spacing w:line="240" w:lineRule="auto"/>
+        <w:ind w:firstLine="0" w:left="-709"/>
+        <w:jc w:val="left"/>
+        <w:rPr>
+          <w:rFonts w:ascii="Times New Roman" w:hAnsi="Times New Roman"/>
+          <w:spacing w:val="0"/>
+          <w:sz w:val="16"/>
+        </w:rPr>
+      </w:pPr>
+    </w:p>
+    <w:p>
+      <w:pPr>
+        <w:widowControl w:val="1"/>
         <w:spacing w:line="240" w:lineRule="auto"/>
         <w:ind w:firstLine="0" w:left="-709"/>
         <w:jc w:val="left"/>
@@ -4395,6 +4579,7 @@
     </w:p>
     <w:p>
       <w:pPr>
+        <w:widowControl w:val="1"/>
         <w:spacing w:line="240" w:lineRule="auto"/>
         <w:ind w:firstLine="0" w:left="-709"/>
         <w:jc w:val="left"/>
@@ -4415,6 +4600,7 @@
     </w:p>
     <w:p>
       <w:pPr>
+        <w:widowControl w:val="1"/>
         <w:spacing w:line="240" w:lineRule="auto"/>
         <w:ind w:firstLine="0" w:left="-709"/>
         <w:jc w:val="left"/>
@@ -4435,6 +4621,7 @@
     </w:p>
     <w:p>
       <w:pPr>
+        <w:widowControl w:val="1"/>
         <w:spacing w:line="240" w:lineRule="auto"/>
         <w:ind w:firstLine="0" w:left="-709"/>
         <w:jc w:val="left"/>
@@ -4455,6 +4642,7 @@
     </w:p>
     <w:p>
       <w:pPr>
+        <w:widowControl w:val="1"/>
         <w:spacing w:line="240" w:lineRule="auto"/>
         <w:ind w:firstLine="0" w:left="-709"/>
         <w:jc w:val="left"/>
@@ -4475,18 +4663,20 @@
     </w:p>
     <w:p>
       <w:pPr>
-        <w:spacing w:line="240" w:lineRule="auto"/>
-        <w:ind w:firstLine="0" w:left="-709"/>
-        <w:jc w:val="left"/>
-        <w:rPr>
-          <w:rFonts w:ascii="Times New Roman" w:hAnsi="Times New Roman"/>
-          <w:spacing w:val="0"/>
-          <w:sz w:val="16"/>
-        </w:rPr>
-      </w:pPr>
-    </w:p>
-    <w:p>
-      <w:pPr>
+        <w:widowControl w:val="1"/>
+        <w:spacing w:line="240" w:lineRule="auto"/>
+        <w:ind w:firstLine="0" w:left="-709"/>
+        <w:jc w:val="left"/>
+        <w:rPr>
+          <w:rFonts w:ascii="Times New Roman" w:hAnsi="Times New Roman"/>
+          <w:spacing w:val="0"/>
+          <w:sz w:val="16"/>
+        </w:rPr>
+      </w:pPr>
+    </w:p>
+    <w:p>
+      <w:pPr>
+        <w:widowControl w:val="1"/>
         <w:spacing w:line="240" w:lineRule="auto"/>
         <w:ind w:firstLine="0" w:left="-709"/>
         <w:jc w:val="left"/>
@@ -4507,18 +4697,20 @@
     </w:p>
     <w:p>
       <w:pPr>
-        <w:spacing w:line="240" w:lineRule="auto"/>
-        <w:ind w:firstLine="0" w:left="-709"/>
-        <w:jc w:val="left"/>
-        <w:rPr>
-          <w:rFonts w:ascii="Times New Roman" w:hAnsi="Times New Roman"/>
-          <w:spacing w:val="0"/>
-          <w:sz w:val="16"/>
-        </w:rPr>
-      </w:pPr>
-    </w:p>
-    <w:p>
-      <w:pPr>
+        <w:widowControl w:val="1"/>
+        <w:spacing w:line="240" w:lineRule="auto"/>
+        <w:ind w:firstLine="0" w:left="-709"/>
+        <w:jc w:val="left"/>
+        <w:rPr>
+          <w:rFonts w:ascii="Times New Roman" w:hAnsi="Times New Roman"/>
+          <w:spacing w:val="0"/>
+          <w:sz w:val="16"/>
+        </w:rPr>
+      </w:pPr>
+    </w:p>
+    <w:p>
+      <w:pPr>
+        <w:widowControl w:val="1"/>
         <w:spacing w:line="240" w:lineRule="auto"/>
         <w:ind w:firstLine="0" w:left="-709"/>
         <w:jc w:val="left"/>
@@ -4539,6 +4731,7 @@
     </w:p>
     <w:p>
       <w:pPr>
+        <w:widowControl w:val="1"/>
         <w:spacing w:line="240" w:lineRule="auto"/>
         <w:ind w:firstLine="0" w:left="-709"/>
         <w:jc w:val="left"/>
@@ -4559,18 +4752,20 @@
     </w:p>
     <w:p>
       <w:pPr>
-        <w:spacing w:line="240" w:lineRule="auto"/>
-        <w:ind w:firstLine="0" w:left="-709"/>
-        <w:jc w:val="left"/>
-        <w:rPr>
-          <w:rFonts w:ascii="Times New Roman" w:hAnsi="Times New Roman"/>
-          <w:spacing w:val="0"/>
-          <w:sz w:val="16"/>
-        </w:rPr>
-      </w:pPr>
-    </w:p>
-    <w:p>
-      <w:pPr>
+        <w:widowControl w:val="1"/>
+        <w:spacing w:line="240" w:lineRule="auto"/>
+        <w:ind w:firstLine="0" w:left="-709"/>
+        <w:jc w:val="left"/>
+        <w:rPr>
+          <w:rFonts w:ascii="Times New Roman" w:hAnsi="Times New Roman"/>
+          <w:spacing w:val="0"/>
+          <w:sz w:val="16"/>
+        </w:rPr>
+      </w:pPr>
+    </w:p>
+    <w:p>
+      <w:pPr>
+        <w:widowControl w:val="1"/>
         <w:spacing w:line="240" w:lineRule="auto"/>
         <w:ind w:firstLine="0" w:left="-709"/>
         <w:jc w:val="left"/>
@@ -4591,6 +4786,7 @@
     </w:p>
     <w:p>
       <w:pPr>
+        <w:widowControl w:val="1"/>
         <w:spacing w:line="240" w:lineRule="auto"/>
         <w:ind w:firstLine="0" w:left="-709"/>
         <w:jc w:val="left"/>
@@ -4611,18 +4807,20 @@
     </w:p>
     <w:p>
       <w:pPr>
-        <w:spacing w:line="240" w:lineRule="auto"/>
-        <w:ind w:firstLine="0" w:left="-709"/>
-        <w:jc w:val="left"/>
-        <w:rPr>
-          <w:rFonts w:ascii="Times New Roman" w:hAnsi="Times New Roman"/>
-          <w:spacing w:val="0"/>
-          <w:sz w:val="16"/>
-        </w:rPr>
-      </w:pPr>
-    </w:p>
-    <w:p>
-      <w:pPr>
+        <w:widowControl w:val="1"/>
+        <w:spacing w:line="240" w:lineRule="auto"/>
+        <w:ind w:firstLine="0" w:left="-709"/>
+        <w:jc w:val="left"/>
+        <w:rPr>
+          <w:rFonts w:ascii="Times New Roman" w:hAnsi="Times New Roman"/>
+          <w:spacing w:val="0"/>
+          <w:sz w:val="16"/>
+        </w:rPr>
+      </w:pPr>
+    </w:p>
+    <w:p>
+      <w:pPr>
+        <w:widowControl w:val="1"/>
         <w:spacing w:line="240" w:lineRule="auto"/>
         <w:ind w:firstLine="0" w:left="-709"/>
         <w:jc w:val="left"/>
@@ -4643,6 +4841,7 @@
     </w:p>
     <w:p>
       <w:pPr>
+        <w:widowControl w:val="1"/>
         <w:spacing w:line="240" w:lineRule="auto"/>
         <w:ind w:firstLine="0" w:left="-709"/>
         <w:jc w:val="left"/>
@@ -4663,6 +4862,7 @@
     </w:p>
     <w:p>
       <w:pPr>
+        <w:widowControl w:val="1"/>
         <w:spacing w:line="240" w:lineRule="auto"/>
         <w:ind w:firstLine="0" w:left="-709"/>
         <w:jc w:val="left"/>
@@ -4683,6 +4883,7 @@
     </w:p>
     <w:p>
       <w:pPr>
+        <w:widowControl w:val="1"/>
         <w:spacing w:line="240" w:lineRule="auto"/>
         <w:ind w:firstLine="0" w:left="-709"/>
         <w:jc w:val="left"/>
@@ -4703,6 +4904,7 @@
     </w:p>
     <w:p>
       <w:pPr>
+        <w:widowControl w:val="1"/>
         <w:spacing w:line="240" w:lineRule="auto"/>
         <w:ind w:firstLine="0" w:left="-709"/>
         <w:jc w:val="left"/>
@@ -4723,18 +4925,20 @@
     </w:p>
     <w:p>
       <w:pPr>
-        <w:spacing w:line="240" w:lineRule="auto"/>
-        <w:ind w:firstLine="0" w:left="-709"/>
-        <w:jc w:val="left"/>
-        <w:rPr>
-          <w:rFonts w:ascii="Times New Roman" w:hAnsi="Times New Roman"/>
-          <w:spacing w:val="0"/>
-          <w:sz w:val="16"/>
-        </w:rPr>
-      </w:pPr>
-    </w:p>
-    <w:p>
-      <w:pPr>
+        <w:widowControl w:val="1"/>
+        <w:spacing w:line="240" w:lineRule="auto"/>
+        <w:ind w:firstLine="0" w:left="-709"/>
+        <w:jc w:val="left"/>
+        <w:rPr>
+          <w:rFonts w:ascii="Times New Roman" w:hAnsi="Times New Roman"/>
+          <w:spacing w:val="0"/>
+          <w:sz w:val="16"/>
+        </w:rPr>
+      </w:pPr>
+    </w:p>
+    <w:p>
+      <w:pPr>
+        <w:widowControl w:val="1"/>
         <w:spacing w:line="240" w:lineRule="auto"/>
         <w:ind w:firstLine="0" w:left="-709"/>
         <w:jc w:val="left"/>
@@ -4755,18 +4959,20 @@
     </w:p>
     <w:p>
       <w:pPr>
-        <w:spacing w:line="240" w:lineRule="auto"/>
-        <w:ind w:firstLine="0" w:left="-709"/>
-        <w:jc w:val="left"/>
-        <w:rPr>
-          <w:rFonts w:ascii="Times New Roman" w:hAnsi="Times New Roman"/>
-          <w:spacing w:val="0"/>
-          <w:sz w:val="16"/>
-        </w:rPr>
-      </w:pPr>
-    </w:p>
-    <w:p>
-      <w:pPr>
+        <w:widowControl w:val="1"/>
+        <w:spacing w:line="240" w:lineRule="auto"/>
+        <w:ind w:firstLine="0" w:left="-709"/>
+        <w:jc w:val="left"/>
+        <w:rPr>
+          <w:rFonts w:ascii="Times New Roman" w:hAnsi="Times New Roman"/>
+          <w:spacing w:val="0"/>
+          <w:sz w:val="16"/>
+        </w:rPr>
+      </w:pPr>
+    </w:p>
+    <w:p>
+      <w:pPr>
+        <w:widowControl w:val="1"/>
         <w:spacing w:line="240" w:lineRule="auto"/>
         <w:ind w:firstLine="0" w:left="-709"/>
         <w:jc w:val="left"/>
@@ -4787,18 +4993,20 @@
     </w:p>
     <w:p>
       <w:pPr>
-        <w:spacing w:line="240" w:lineRule="auto"/>
-        <w:ind w:firstLine="0" w:left="-709"/>
-        <w:jc w:val="left"/>
-        <w:rPr>
-          <w:rFonts w:ascii="Times New Roman" w:hAnsi="Times New Roman"/>
-          <w:spacing w:val="0"/>
-          <w:sz w:val="16"/>
-        </w:rPr>
-      </w:pPr>
-    </w:p>
-    <w:p>
-      <w:pPr>
+        <w:widowControl w:val="1"/>
+        <w:spacing w:line="240" w:lineRule="auto"/>
+        <w:ind w:firstLine="0" w:left="-709"/>
+        <w:jc w:val="left"/>
+        <w:rPr>
+          <w:rFonts w:ascii="Times New Roman" w:hAnsi="Times New Roman"/>
+          <w:spacing w:val="0"/>
+          <w:sz w:val="16"/>
+        </w:rPr>
+      </w:pPr>
+    </w:p>
+    <w:p>
+      <w:pPr>
+        <w:widowControl w:val="1"/>
         <w:spacing w:line="240" w:lineRule="auto"/>
         <w:ind w:firstLine="0" w:left="-709"/>
         <w:jc w:val="left"/>
@@ -4819,6 +5027,7 @@
     </w:p>
     <w:p>
       <w:pPr>
+        <w:widowControl w:val="1"/>
         <w:spacing w:line="240" w:lineRule="auto"/>
         <w:ind w:firstLine="0" w:left="-709"/>
         <w:jc w:val="left"/>
@@ -4839,6 +5048,7 @@
     </w:p>
     <w:p>
       <w:pPr>
+        <w:widowControl w:val="1"/>
         <w:spacing w:line="240" w:lineRule="auto"/>
         <w:ind w:firstLine="0" w:left="-709"/>
         <w:jc w:val="left"/>
@@ -4859,18 +5069,20 @@
     </w:p>
     <w:p>
       <w:pPr>
-        <w:spacing w:line="240" w:lineRule="auto"/>
-        <w:ind w:firstLine="0" w:left="-709"/>
-        <w:jc w:val="left"/>
-        <w:rPr>
-          <w:rFonts w:ascii="Times New Roman" w:hAnsi="Times New Roman"/>
-          <w:spacing w:val="0"/>
-          <w:sz w:val="16"/>
-        </w:rPr>
-      </w:pPr>
-    </w:p>
-    <w:p>
-      <w:pPr>
+        <w:widowControl w:val="1"/>
+        <w:spacing w:line="240" w:lineRule="auto"/>
+        <w:ind w:firstLine="0" w:left="-709"/>
+        <w:jc w:val="left"/>
+        <w:rPr>
+          <w:rFonts w:ascii="Times New Roman" w:hAnsi="Times New Roman"/>
+          <w:spacing w:val="0"/>
+          <w:sz w:val="16"/>
+        </w:rPr>
+      </w:pPr>
+    </w:p>
+    <w:p>
+      <w:pPr>
+        <w:widowControl w:val="1"/>
         <w:spacing w:line="240" w:lineRule="auto"/>
         <w:ind w:firstLine="0" w:left="-709"/>
         <w:jc w:val="left"/>
@@ -4891,6 +5103,7 @@
     </w:p>
     <w:p>
       <w:pPr>
+        <w:widowControl w:val="1"/>
         <w:spacing w:line="240" w:lineRule="auto"/>
         <w:ind w:firstLine="0" w:left="-709"/>
         <w:jc w:val="left"/>
@@ -4911,6 +5124,7 @@
     </w:p>
     <w:p>
       <w:pPr>
+        <w:widowControl w:val="1"/>
         <w:spacing w:line="240" w:lineRule="auto"/>
         <w:ind w:firstLine="0" w:left="-709"/>
         <w:jc w:val="left"/>
@@ -4931,6 +5145,7 @@
     </w:p>
     <w:p>
       <w:pPr>
+        <w:widowControl w:val="1"/>
         <w:spacing w:line="240" w:lineRule="auto"/>
         <w:ind w:firstLine="0" w:left="-709"/>
         <w:jc w:val="left"/>
@@ -4951,6 +5166,7 @@
     </w:p>
     <w:p>
       <w:pPr>
+        <w:widowControl w:val="1"/>
         <w:spacing w:line="240" w:lineRule="auto"/>
         <w:ind w:firstLine="0" w:left="-709"/>
         <w:jc w:val="left"/>
@@ -4971,6 +5187,7 @@
     </w:p>
     <w:p>
       <w:pPr>
+        <w:widowControl w:val="1"/>
         <w:spacing w:line="240" w:lineRule="auto"/>
         <w:ind w:firstLine="0" w:left="-709"/>
         <w:jc w:val="left"/>
@@ -4991,18 +5208,20 @@
     </w:p>
     <w:p>
       <w:pPr>
-        <w:spacing w:line="240" w:lineRule="auto"/>
-        <w:ind w:firstLine="0" w:left="-709"/>
-        <w:jc w:val="left"/>
-        <w:rPr>
-          <w:rFonts w:ascii="Times New Roman" w:hAnsi="Times New Roman"/>
-          <w:spacing w:val="0"/>
-          <w:sz w:val="16"/>
-        </w:rPr>
-      </w:pPr>
-    </w:p>
-    <w:p>
-      <w:pPr>
+        <w:widowControl w:val="1"/>
+        <w:spacing w:line="240" w:lineRule="auto"/>
+        <w:ind w:firstLine="0" w:left="-709"/>
+        <w:jc w:val="left"/>
+        <w:rPr>
+          <w:rFonts w:ascii="Times New Roman" w:hAnsi="Times New Roman"/>
+          <w:spacing w:val="0"/>
+          <w:sz w:val="16"/>
+        </w:rPr>
+      </w:pPr>
+    </w:p>
+    <w:p>
+      <w:pPr>
+        <w:widowControl w:val="1"/>
         <w:spacing w:line="240" w:lineRule="auto"/>
         <w:ind w:firstLine="0" w:left="-709"/>
         <w:jc w:val="left"/>
@@ -5023,6 +5242,7 @@
     </w:p>
     <w:p>
       <w:pPr>
+        <w:widowControl w:val="1"/>
         <w:spacing w:line="240" w:lineRule="auto"/>
         <w:ind w:firstLine="0" w:left="-709"/>
         <w:jc w:val="left"/>
@@ -5043,6 +5263,7 @@
     </w:p>
     <w:p>
       <w:pPr>
+        <w:widowControl w:val="1"/>
         <w:spacing w:line="240" w:lineRule="auto"/>
         <w:ind w:firstLine="0" w:left="-709"/>
         <w:jc w:val="left"/>
@@ -5063,6 +5284,7 @@
     </w:p>
     <w:p>
       <w:pPr>
+        <w:widowControl w:val="1"/>
         <w:spacing w:line="240" w:lineRule="auto"/>
         <w:ind w:firstLine="0" w:left="-709"/>
         <w:jc w:val="left"/>
@@ -5083,18 +5305,20 @@
     </w:p>
     <w:p>
       <w:pPr>
-        <w:spacing w:line="240" w:lineRule="auto"/>
-        <w:ind w:firstLine="0" w:left="-709"/>
-        <w:jc w:val="left"/>
-        <w:rPr>
-          <w:rFonts w:ascii="Times New Roman" w:hAnsi="Times New Roman"/>
-          <w:spacing w:val="0"/>
-          <w:sz w:val="16"/>
-        </w:rPr>
-      </w:pPr>
-    </w:p>
-    <w:p>
-      <w:pPr>
+        <w:widowControl w:val="1"/>
+        <w:spacing w:line="240" w:lineRule="auto"/>
+        <w:ind w:firstLine="0" w:left="-709"/>
+        <w:jc w:val="left"/>
+        <w:rPr>
+          <w:rFonts w:ascii="Times New Roman" w:hAnsi="Times New Roman"/>
+          <w:spacing w:val="0"/>
+          <w:sz w:val="16"/>
+        </w:rPr>
+      </w:pPr>
+    </w:p>
+    <w:p>
+      <w:pPr>
+        <w:widowControl w:val="1"/>
         <w:spacing w:line="240" w:lineRule="auto"/>
         <w:ind w:firstLine="0" w:left="-709"/>
         <w:jc w:val="left"/>
@@ -5115,6 +5339,7 @@
     </w:p>
     <w:p>
       <w:pPr>
+        <w:widowControl w:val="1"/>
         <w:spacing w:line="240" w:lineRule="auto"/>
         <w:ind w:firstLine="0" w:left="-709"/>
         <w:jc w:val="left"/>
@@ -5135,30 +5360,33 @@
     </w:p>
     <w:p>
       <w:pPr>
-        <w:spacing w:line="240" w:lineRule="auto"/>
-        <w:ind w:firstLine="0" w:left="-709"/>
-        <w:jc w:val="left"/>
-        <w:rPr>
-          <w:rFonts w:ascii="Times New Roman" w:hAnsi="Times New Roman"/>
-          <w:spacing w:val="0"/>
-          <w:sz w:val="16"/>
-        </w:rPr>
-      </w:pPr>
-    </w:p>
-    <w:p>
-      <w:pPr>
-        <w:spacing w:line="240" w:lineRule="auto"/>
-        <w:ind w:firstLine="0" w:left="-709"/>
-        <w:jc w:val="left"/>
-        <w:rPr>
-          <w:rFonts w:ascii="Times New Roman" w:hAnsi="Times New Roman"/>
-          <w:spacing w:val="0"/>
-          <w:sz w:val="16"/>
-        </w:rPr>
-      </w:pPr>
-    </w:p>
-    <w:p>
-      <w:pPr>
+        <w:widowControl w:val="1"/>
+        <w:spacing w:line="240" w:lineRule="auto"/>
+        <w:ind w:firstLine="0" w:left="-709"/>
+        <w:jc w:val="left"/>
+        <w:rPr>
+          <w:rFonts w:ascii="Times New Roman" w:hAnsi="Times New Roman"/>
+          <w:spacing w:val="0"/>
+          <w:sz w:val="16"/>
+        </w:rPr>
+      </w:pPr>
+    </w:p>
+    <w:p>
+      <w:pPr>
+        <w:widowControl w:val="1"/>
+        <w:spacing w:line="240" w:lineRule="auto"/>
+        <w:ind w:firstLine="0" w:left="-709"/>
+        <w:jc w:val="left"/>
+        <w:rPr>
+          <w:rFonts w:ascii="Times New Roman" w:hAnsi="Times New Roman"/>
+          <w:spacing w:val="0"/>
+          <w:sz w:val="16"/>
+        </w:rPr>
+      </w:pPr>
+    </w:p>
+    <w:p>
+      <w:pPr>
+        <w:widowControl w:val="1"/>
         <w:spacing w:line="240" w:lineRule="auto"/>
         <w:ind w:firstLine="0" w:left="-709"/>
         <w:jc w:val="left"/>
@@ -5179,6 +5407,7 @@
     </w:p>
     <w:p>
       <w:pPr>
+        <w:widowControl w:val="1"/>
         <w:spacing w:line="240" w:lineRule="auto"/>
         <w:ind w:firstLine="0" w:left="-709"/>
         <w:jc w:val="left"/>
@@ -5199,6 +5428,7 @@
     </w:p>
     <w:p>
       <w:pPr>
+        <w:widowControl w:val="1"/>
         <w:spacing w:line="240" w:lineRule="auto"/>
         <w:ind w:firstLine="0" w:left="-709"/>
         <w:jc w:val="left"/>
@@ -5219,6 +5449,7 @@
     </w:p>
     <w:p>
       <w:pPr>
+        <w:widowControl w:val="1"/>
         <w:spacing w:line="240" w:lineRule="auto"/>
         <w:ind w:firstLine="0" w:left="-709"/>
         <w:jc w:val="left"/>
@@ -5239,6 +5470,7 @@
     </w:p>
     <w:p>
       <w:pPr>
+        <w:widowControl w:val="1"/>
         <w:spacing w:line="240" w:lineRule="auto"/>
         <w:ind w:firstLine="0" w:left="-709"/>
         <w:jc w:val="left"/>
@@ -5259,6 +5491,7 @@
     </w:p>
     <w:p>
       <w:pPr>
+        <w:widowControl w:val="1"/>
         <w:spacing w:line="240" w:lineRule="auto"/>
         <w:ind w:firstLine="0" w:left="-709"/>
         <w:jc w:val="left"/>
@@ -5279,30 +5512,33 @@
     </w:p>
     <w:p>
       <w:pPr>
-        <w:spacing w:line="240" w:lineRule="auto"/>
-        <w:ind w:firstLine="0" w:left="-709"/>
-        <w:jc w:val="left"/>
-        <w:rPr>
-          <w:rFonts w:ascii="Times New Roman" w:hAnsi="Times New Roman"/>
-          <w:spacing w:val="0"/>
-          <w:sz w:val="16"/>
-        </w:rPr>
-      </w:pPr>
-    </w:p>
-    <w:p>
-      <w:pPr>
-        <w:spacing w:line="240" w:lineRule="auto"/>
-        <w:ind w:firstLine="0" w:left="-709"/>
-        <w:jc w:val="left"/>
-        <w:rPr>
-          <w:rFonts w:ascii="Times New Roman" w:hAnsi="Times New Roman"/>
-          <w:spacing w:val="0"/>
-          <w:sz w:val="16"/>
-        </w:rPr>
-      </w:pPr>
-    </w:p>
-    <w:p>
-      <w:pPr>
+        <w:widowControl w:val="1"/>
+        <w:spacing w:line="240" w:lineRule="auto"/>
+        <w:ind w:firstLine="0" w:left="-709"/>
+        <w:jc w:val="left"/>
+        <w:rPr>
+          <w:rFonts w:ascii="Times New Roman" w:hAnsi="Times New Roman"/>
+          <w:spacing w:val="0"/>
+          <w:sz w:val="16"/>
+        </w:rPr>
+      </w:pPr>
+    </w:p>
+    <w:p>
+      <w:pPr>
+        <w:widowControl w:val="1"/>
+        <w:spacing w:line="240" w:lineRule="auto"/>
+        <w:ind w:firstLine="0" w:left="-709"/>
+        <w:jc w:val="left"/>
+        <w:rPr>
+          <w:rFonts w:ascii="Times New Roman" w:hAnsi="Times New Roman"/>
+          <w:spacing w:val="0"/>
+          <w:sz w:val="16"/>
+        </w:rPr>
+      </w:pPr>
+    </w:p>
+    <w:p>
+      <w:pPr>
+        <w:widowControl w:val="1"/>
         <w:spacing w:line="240" w:lineRule="auto"/>
         <w:ind w:firstLine="0" w:left="-709"/>
         <w:jc w:val="left"/>
@@ -5323,6 +5559,7 @@
     </w:p>
     <w:p>
       <w:pPr>
+        <w:widowControl w:val="1"/>
         <w:spacing w:line="240" w:lineRule="auto"/>
         <w:ind w:firstLine="0" w:left="-709"/>
         <w:jc w:val="left"/>
@@ -5343,6 +5580,7 @@
     </w:p>
     <w:p>
       <w:pPr>
+        <w:widowControl w:val="1"/>
         <w:spacing w:line="240" w:lineRule="auto"/>
         <w:ind w:firstLine="0" w:left="-709"/>
         <w:jc w:val="left"/>
@@ -5363,6 +5601,7 @@
     </w:p>
     <w:p>
       <w:pPr>
+        <w:widowControl w:val="1"/>
         <w:spacing w:line="240" w:lineRule="auto"/>
         <w:ind w:firstLine="0" w:left="-709"/>
         <w:jc w:val="left"/>

</xml_diff>